<commit_message>
Correct nine drifted t-statistics; record verification status
Audited every numeric claim in the report chapters against results/.
All effect sizes, means, standard deviations, win counts, floors and
ceilings reproduce exactly. Nine t-statistics differed in the last
significant figure from a fresh recomputation, the largest being the
CICIDS k=8 global row at 213.4 against 212.62. Corrected in
ch7_evaluation.tex and in both Word documents, which were rebuilt and
re-highlighted. No conclusion changed.

Also fixes the NSL-KDD team-count row in docs/results.md, which compared
one team against four rather than against ten as labelled.

Co-Authored-By: Claude Opus 5 <noreply@anthropic.com>
</commit_message>
<xml_diff>
--- a/report/PerMFL_report_alt_full.docx
+++ b/report/PerMFL_report_alt_full.docx
@@ -3850,7 +3850,7 @@
               <w:rPr>
                 <w:sz w:val="17"/>
               </w:rPr>
-              <w:t xml:space="preserve">+0.0345</w:t>
+              <w:t xml:space="preserve">+0.0346</w:t>
             </w:r>
           </w:p>
         </w:tc>
@@ -3866,7 +3866,7 @@
               <w:rPr>
                 <w:sz w:val="17"/>
               </w:rPr>
-              <w:t xml:space="preserve">21.28</w:t>
+              <w:t xml:space="preserve">21.25</w:t>
             </w:r>
           </w:p>
         </w:tc>
@@ -3982,7 +3982,7 @@
               <w:rPr>
                 <w:sz w:val="17"/>
               </w:rPr>
-              <w:t xml:space="preserve">0.1139 pm 0.0345</w:t>
+              <w:t xml:space="preserve">0.1139 pm 0.0346</w:t>
             </w:r>
           </w:p>
         </w:tc>
@@ -4500,7 +4500,7 @@
               <w:rPr>
                 <w:sz w:val="17"/>
               </w:rPr>
-              <w:t xml:space="preserve">32.49</w:t>
+              <w:t xml:space="preserve">32.27</w:t>
             </w:r>
           </w:p>
         </w:tc>
@@ -4532,7 +4532,7 @@
               <w:rPr>
                 <w:sz w:val="17"/>
               </w:rPr>
-              <w:t xml:space="preserve">44.74</w:t>
+              <w:t xml:space="preserve">44.69</w:t>
             </w:r>
           </w:p>
         </w:tc>
@@ -4614,7 +4614,7 @@
               <w:rPr>
                 <w:sz w:val="17"/>
               </w:rPr>
-              <w:t xml:space="preserve">36.39</w:t>
+              <w:t xml:space="preserve">36.52</w:t>
             </w:r>
           </w:p>
         </w:tc>
@@ -4646,7 +4646,7 @@
               <w:rPr>
                 <w:sz w:val="17"/>
               </w:rPr>
-              <w:t xml:space="preserve">57.91</w:t>
+              <w:t xml:space="preserve">58.02</w:t>
             </w:r>
           </w:p>
         </w:tc>
@@ -4728,7 +4728,7 @@
               <w:rPr>
                 <w:sz w:val="17"/>
               </w:rPr>
-              <w:t xml:space="preserve">82.83</w:t>
+              <w:t xml:space="preserve">82.92</w:t>
             </w:r>
           </w:p>
         </w:tc>
@@ -4760,7 +4760,7 @@
               <w:rPr>
                 <w:sz w:val="17"/>
               </w:rPr>
-              <w:t xml:space="preserve">213.4</w:t>
+              <w:t xml:space="preserve">212.62</w:t>
             </w:r>
           </w:p>
         </w:tc>
@@ -4842,7 +4842,7 @@
               <w:rPr>
                 <w:sz w:val="17"/>
               </w:rPr>
-              <w:t xml:space="preserve">5.84</w:t>
+              <w:t xml:space="preserve">5.85</w:t>
             </w:r>
           </w:p>
         </w:tc>
@@ -4858,7 +4858,7 @@
               <w:rPr>
                 <w:sz w:val="17"/>
               </w:rPr>
-              <w:t xml:space="preserve">+0.1572</w:t>
+              <w:t xml:space="preserve">+0.1573</w:t>
             </w:r>
           </w:p>
         </w:tc>
@@ -4874,7 +4874,7 @@
               <w:rPr>
                 <w:sz w:val="17"/>
               </w:rPr>
-              <w:t xml:space="preserve">7.78</w:t>
+              <w:t xml:space="preserve">7.77</w:t>
             </w:r>
           </w:p>
         </w:tc>
@@ -4940,7 +4940,7 @@
               <w:rPr>
                 <w:sz w:val="17"/>
               </w:rPr>
-              <w:t xml:space="preserve">+0.1093</w:t>
+              <w:t xml:space="preserve">+0.1094</w:t>
             </w:r>
           </w:p>
         </w:tc>
@@ -4956,7 +4956,7 @@
               <w:rPr>
                 <w:sz w:val="17"/>
               </w:rPr>
-              <w:t xml:space="preserve">17.44</w:t>
+              <w:t xml:space="preserve">17.43</w:t>
             </w:r>
           </w:p>
         </w:tc>
@@ -4988,7 +4988,7 @@
               <w:rPr>
                 <w:sz w:val="17"/>
               </w:rPr>
-              <w:t xml:space="preserve">8.86</w:t>
+              <w:t xml:space="preserve">8.87</w:t>
             </w:r>
           </w:p>
         </w:tc>
@@ -5070,7 +5070,7 @@
               <w:rPr>
                 <w:sz w:val="17"/>
               </w:rPr>
-              <w:t xml:space="preserve">20.01</w:t>
+              <w:t xml:space="preserve">19.98</w:t>
             </w:r>
           </w:p>
         </w:tc>
@@ -5102,7 +5102,7 @@
               <w:rPr>
                 <w:sz w:val="17"/>
               </w:rPr>
-              <w:t xml:space="preserve">26.76</w:t>
+              <w:t xml:space="preserve">26.75</w:t>
             </w:r>
           </w:p>
         </w:tc>
@@ -5184,7 +5184,7 @@
               <w:rPr>
                 <w:sz w:val="17"/>
               </w:rPr>
-              <w:t xml:space="preserve">12.98</w:t>
+              <w:t xml:space="preserve">12.95</w:t>
             </w:r>
           </w:p>
         </w:tc>
@@ -5298,7 +5298,7 @@
               <w:rPr>
                 <w:sz w:val="17"/>
               </w:rPr>
-              <w:t xml:space="preserve">16.29</w:t>
+              <w:t xml:space="preserve">16.28</w:t>
             </w:r>
           </w:p>
         </w:tc>
@@ -5314,7 +5314,7 @@
               <w:rPr>
                 <w:sz w:val="17"/>
               </w:rPr>
-              <w:t xml:space="preserve">+0.1128</w:t>
+              <w:t xml:space="preserve">+0.1129</w:t>
             </w:r>
           </w:p>
         </w:tc>
@@ -5330,7 +5330,7 @@
               <w:rPr>
                 <w:sz w:val="17"/>
               </w:rPr>
-              <w:t xml:space="preserve">5.75</w:t>
+              <w:t xml:space="preserve">5.76</w:t>
             </w:r>
           </w:p>
         </w:tc>

</xml_diff>

<commit_message>
Embed figures in the Word draft
splice.py now handles markdown image syntax, copying PNGs into
word/media, registering image relationships and declaring the png
content type. Each figure gets a centred inline image at six inches wide
with a numbered caption below.

Five figures placed: architecture in Design, components in
Implementation, global convergence and the heterogeneity gain in
Evaluation, and the EMNIST confusion matrices before the variance
section.

Also repoints TMPL at report/template/report.docx so the build no longer
reads from the SCMoE tree.

Co-Authored-By: Claude Opus 5 <noreply@anthropic.com>
</commit_message>
<xml_diff>
--- a/report/PerMFL_report_alt_full.docx
+++ b/report/PerMFL_report_alt_full.docx
@@ -2361,6 +2361,64 @@
       </w:r>
     </w:p>
     <w:p>
+      <w:pPr>
+        <w:jc w:val="center"/>
+        <w:spacing w:before="180" w:after="60"/>
+      </w:pPr>
+      <w:r>
+        <w:drawing>
+          <wp:inline distT="0" distB="0" distL="0" distR="0">
+            <wp:extent cx="5486400" cy="2815425"/>
+            <wp:docPr id="1" name="Figure 1"/>
+            <a:graphic xmlns:a="http://schemas.openxmlformats.org/drawingml/2006/main">
+              <a:graphicData uri="http://schemas.openxmlformats.org/drawingml/2006/picture">
+                <pic:pic xmlns:pic="http://schemas.openxmlformats.org/drawingml/2006/picture">
+                  <pic:nvPicPr>
+                    <pic:cNvPr id="1" name="Figure 1"/>
+                    <pic:cNvPicPr/>
+                  </pic:nvPicPr>
+                  <pic:blipFill>
+                    <a:blip r:embed="rIdFig1"/>
+                    <a:stretch>
+                      <a:fillRect/>
+                    </a:stretch>
+                  </pic:blipFill>
+                  <pic:spPr>
+                    <a:xfrm>
+                      <a:off x="0" y="0"/>
+                      <a:ext cx="5486400" cy="2815425"/>
+                    </a:xfrm>
+                    <a:prstGeom prst="rect">
+                      <a:avLst/>
+                    </a:prstGeom>
+                  </pic:spPr>
+                </pic:pic>
+              </a:graphicData>
+            </a:graphic>
+          </wp:inline>
+        </w:drawing>
+      </w:r>
+    </w:p>
+    <w:p>
+      <w:pPr>
+        <w:jc w:val="center"/>
+        <w:spacing w:after="220"/>
+      </w:pPr>
+      <w:r>
+        <w:rPr>
+          <w:b/>
+          <w:sz w:val="18"/>
+        </w:rPr>
+        <w:t xml:space="preserve">Figure 1: </w:t>
+      </w:r>
+      <w:r>
+        <w:rPr>
+          <w:sz w:val="18"/>
+        </w:rPr>
+        <w:t xml:space="preserve">Three-tier structure of PerMFL. Device parameters are pulled toward the team model, team models toward the global model. The weight the team places on its members is the parameter this project separates.</w:t>
+      </w:r>
+    </w:p>
+    <w:p>
       <w:pPr/>
       <w:r>
         <w:t xml:space="preserve">The training loop nests three counters. Each global round $t$ runs $K$ team rounds, and each team round runs $L$ local gradient steps on every participating device. At the start of a global round every team model is overwritten with the current global model. At the start of every team round every device model is overwritten with its team's model. A device therefore travels at most $L$ steps from its team model before being reset, a property that Section~(see above) shows to be the dominant influence on personalised performance.</w:t>
@@ -2773,6 +2831,64 @@
       <w:pPr/>
       <w:r>
         <w:t xml:space="preserve">Four changes were made, each defaulting to the shipped behaviour.</w:t>
+      </w:r>
+    </w:p>
+    <w:p>
+      <w:pPr>
+        <w:jc w:val="center"/>
+        <w:spacing w:before="180" w:after="60"/>
+      </w:pPr>
+      <w:r>
+        <w:drawing>
+          <wp:inline distT="0" distB="0" distL="0" distR="0">
+            <wp:extent cx="5486400" cy="3094576"/>
+            <wp:docPr id="2" name="Figure 2"/>
+            <a:graphic xmlns:a="http://schemas.openxmlformats.org/drawingml/2006/main">
+              <a:graphicData uri="http://schemas.openxmlformats.org/drawingml/2006/picture">
+                <pic:pic xmlns:pic="http://schemas.openxmlformats.org/drawingml/2006/picture">
+                  <pic:nvPicPr>
+                    <pic:cNvPr id="2" name="Figure 2"/>
+                    <pic:cNvPicPr/>
+                  </pic:nvPicPr>
+                  <pic:blipFill>
+                    <a:blip r:embed="rIdFig2"/>
+                    <a:stretch>
+                      <a:fillRect/>
+                    </a:stretch>
+                  </pic:blipFill>
+                  <pic:spPr>
+                    <a:xfrm>
+                      <a:off x="0" y="0"/>
+                      <a:ext cx="5486400" cy="3094576"/>
+                    </a:xfrm>
+                    <a:prstGeom prst="rect">
+                      <a:avLst/>
+                    </a:prstGeom>
+                  </pic:spPr>
+                </pic:pic>
+              </a:graphicData>
+            </a:graphic>
+          </wp:inline>
+        </w:drawing>
+      </w:r>
+    </w:p>
+    <w:p>
+      <w:pPr>
+        <w:jc w:val="center"/>
+        <w:spacing w:after="220"/>
+      </w:pPr>
+      <w:r>
+        <w:rPr>
+          <w:b/>
+          <w:sz w:val="18"/>
+        </w:rPr>
+        <w:t xml:space="preserve">Figure 2: </w:t>
+      </w:r>
+      <w:r>
+        <w:rPr>
+          <w:sz w:val="18"/>
+        </w:rPr>
+        <w:t xml:space="preserve">Component structure of the PerMFL path. The clustering module is engaged only under group division 3.</w:t>
       </w:r>
     </w:p>
     <w:p>
@@ -3592,6 +3708,64 @@
       <w:pPr/>
       <w:r>
         <w:t xml:space="preserve">PerMFL's premise is that it applies when known team structures exist across devices. The direct test is to vary the team structure and measure the effect.</w:t>
+      </w:r>
+    </w:p>
+    <w:p>
+      <w:pPr>
+        <w:jc w:val="center"/>
+        <w:spacing w:before="180" w:after="60"/>
+      </w:pPr>
+      <w:r>
+        <w:drawing>
+          <wp:inline distT="0" distB="0" distL="0" distR="0">
+            <wp:extent cx="5486400" cy="1416785"/>
+            <wp:docPr id="3" name="Figure 3"/>
+            <a:graphic xmlns:a="http://schemas.openxmlformats.org/drawingml/2006/main">
+              <a:graphicData uri="http://schemas.openxmlformats.org/drawingml/2006/picture">
+                <pic:pic xmlns:pic="http://schemas.openxmlformats.org/drawingml/2006/picture">
+                  <pic:nvPicPr>
+                    <pic:cNvPr id="3" name="Figure 3"/>
+                    <pic:cNvPicPr/>
+                  </pic:nvPicPr>
+                  <pic:blipFill>
+                    <a:blip r:embed="rIdFig3"/>
+                    <a:stretch>
+                      <a:fillRect/>
+                    </a:stretch>
+                  </pic:blipFill>
+                  <pic:spPr>
+                    <a:xfrm>
+                      <a:off x="0" y="0"/>
+                      <a:ext cx="5486400" cy="1416785"/>
+                    </a:xfrm>
+                    <a:prstGeom prst="rect">
+                      <a:avLst/>
+                    </a:prstGeom>
+                  </pic:spPr>
+                </pic:pic>
+              </a:graphicData>
+            </a:graphic>
+          </wp:inline>
+        </w:drawing>
+      </w:r>
+    </w:p>
+    <w:p>
+      <w:pPr>
+        <w:jc w:val="center"/>
+        <w:spacing w:after="220"/>
+      </w:pPr>
+      <w:r>
+        <w:rPr>
+          <w:b/>
+          <w:sz w:val="18"/>
+        </w:rPr>
+        <w:t xml:space="preserve">Figure 3: </w:t>
+      </w:r>
+      <w:r>
+        <w:rPr>
+          <w:sz w:val="18"/>
+        </w:rPr>
+        <w:t xml:space="preserve">Global model macro F1 against global round, four datasets, both arms. The shaded band spans the seeds.</w:t>
       </w:r>
     </w:p>
     <w:p>
@@ -4136,13 +4310,67 @@
     </w:p>
     <w:p>
       <w:pPr>
+        <w:jc w:val="center"/>
         <w:spacing w:before="180" w:after="60"/>
       </w:pPr>
       <w:r>
+        <w:drawing>
+          <wp:inline distT="0" distB="0" distL="0" distR="0">
+            <wp:extent cx="5486400" cy="2749855"/>
+            <wp:docPr id="4" name="Figure 4"/>
+            <a:graphic xmlns:a="http://schemas.openxmlformats.org/drawingml/2006/main">
+              <a:graphicData uri="http://schemas.openxmlformats.org/drawingml/2006/picture">
+                <pic:pic xmlns:pic="http://schemas.openxmlformats.org/drawingml/2006/picture">
+                  <pic:nvPicPr>
+                    <pic:cNvPr id="4" name="Figure 4"/>
+                    <pic:cNvPicPr/>
+                  </pic:nvPicPr>
+                  <pic:blipFill>
+                    <a:blip r:embed="rIdFig4"/>
+                    <a:stretch>
+                      <a:fillRect/>
+                    </a:stretch>
+                  </pic:blipFill>
+                  <pic:spPr>
+                    <a:xfrm>
+                      <a:off x="0" y="0"/>
+                      <a:ext cx="5486400" cy="2749855"/>
+                    </a:xfrm>
+                    <a:prstGeom prst="rect">
+                      <a:avLst/>
+                    </a:prstGeom>
+                  </pic:spPr>
+                </pic:pic>
+              </a:graphicData>
+            </a:graphic>
+          </wp:inline>
+        </w:drawing>
+      </w:r>
+    </w:p>
+    <w:p>
+      <w:pPr>
+        <w:jc w:val="center"/>
+        <w:spacing w:after="220"/>
+      </w:pPr>
+      <w:r>
         <w:rPr>
           <w:b/>
-          <w:i/>
-        </w:rPr>
+          <w:sz w:val="18"/>
+        </w:rPr>
+        <w:t xml:space="preserve">Figure 4: </w:t>
+      </w:r>
+      <w:r>
+        <w:rPr>
+          <w:sz w:val="18"/>
+        </w:rPr>
+        <w:t xml:space="preserve">Confusion matrices for the global model on EMNIST-10 at 40 devices, row normalised. The largest single improvement is the digit five predicted as three.</w:t>
+      </w:r>
+    </w:p>
+    <w:p>
+      <w:pPr>
+        <w:pStyle w:val="Heading3"/>
+      </w:pPr>
+      <w:r>
         <w:t xml:space="preserve">Variance</w:t>
       </w:r>
     </w:p>
@@ -5346,6 +5574,64 @@
       </w:tr>
     </w:tbl>
     <w:p/>
+    <w:p>
+      <w:pPr>
+        <w:jc w:val="center"/>
+        <w:spacing w:before="180" w:after="60"/>
+      </w:pPr>
+      <w:r>
+        <w:drawing>
+          <wp:inline distT="0" distB="0" distL="0" distR="0">
+            <wp:extent cx="5486400" cy="2186550"/>
+            <wp:docPr id="5" name="Figure 5"/>
+            <a:graphic xmlns:a="http://schemas.openxmlformats.org/drawingml/2006/main">
+              <a:graphicData uri="http://schemas.openxmlformats.org/drawingml/2006/picture">
+                <pic:pic xmlns:pic="http://schemas.openxmlformats.org/drawingml/2006/picture">
+                  <pic:nvPicPr>
+                    <pic:cNvPr id="5" name="Figure 5"/>
+                    <pic:cNvPicPr/>
+                  </pic:nvPicPr>
+                  <pic:blipFill>
+                    <a:blip r:embed="rIdFig5"/>
+                    <a:stretch>
+                      <a:fillRect/>
+                    </a:stretch>
+                  </pic:blipFill>
+                  <pic:spPr>
+                    <a:xfrm>
+                      <a:off x="0" y="0"/>
+                      <a:ext cx="5486400" cy="2186550"/>
+                    </a:xfrm>
+                    <a:prstGeom prst="rect">
+                      <a:avLst/>
+                    </a:prstGeom>
+                  </pic:spPr>
+                </pic:pic>
+              </a:graphicData>
+            </a:graphic>
+          </wp:inline>
+        </w:drawing>
+      </w:r>
+    </w:p>
+    <w:p>
+      <w:pPr>
+        <w:jc w:val="center"/>
+        <w:spacing w:after="220"/>
+      </w:pPr>
+      <w:r>
+        <w:rPr>
+          <w:b/>
+          <w:sz w:val="18"/>
+        </w:rPr>
+        <w:t xml:space="preserve">Figure 5: </w:t>
+      </w:r>
+      <w:r>
+        <w:rPr>
+          <w:sz w:val="18"/>
+        </w:rPr>
+        <w:t xml:space="preserve">Gain from separating the two roles of lambda, against client heterogeneity. The trend is negative on CICIDS2017 and TON-IoT and positive on NSL-KDD.</w:t>
+      </w:r>
+    </w:p>
     <w:p>
       <w:pPr/>
       <w:r>

</xml_diff>

<commit_message>
Add the paper-configuration result to Chapter 7
New Evaluation section reporting EMNIST-10 at the paper's own stated
setup: forty devices in four teams, T=400, K=10, L=20, MCLR, and the
paper's hyperparameters. Fine Tuned reaches the published 91.68 global
accuracy on all three seeds, PerMFL on none, with no overlap between
arms.

States the claim narrowly, notes that the comparison uses a peak against
a published figure of unstated horizon, and records that the gain shrinks
from 0.0418 at T=100 to 0.0152 at T=400 so the correction buys
convergence speed as well as final quality.

Draft is now 10,347 words, within the handbook's 10,000 to 15,000 range.

Co-Authored-By: Claude Opus 5 <noreply@anthropic.com>
</commit_message>
<xml_diff>
--- a/report/PerMFL_report_alt_full.docx
+++ b/report/PerMFL_report_alt_full.docx
@@ -4364,6 +4364,982 @@
           <w:sz w:val="18"/>
         </w:rPr>
         <w:t xml:space="preserve">Confusion matrices for the global model on EMNIST-10 at 40 devices, row normalised. The largest single improvement is the digit five predicted as three.</w:t>
+      </w:r>
+    </w:p>
+    <w:p>
+      <w:pPr>
+        <w:pStyle w:val="Heading3"/>
+      </w:pPr>
+      <w:r>
+        <w:t xml:space="preserve">The paper's own configuration</w:t>
+      </w:r>
+    </w:p>
+    <w:p>
+      <w:pPr/>
+      <w:r>
+        <w:t xml:space="preserve">The results above use configurations chosen for this project. The strongest test of a correction to a published method is whether it holds at that method's own stated setup, so the comparison was repeated on EMNIST-10 with forty devices in four teams of ten, full participation, four hundred global rounds, ten team rounds and twenty local steps, multi-class logistic regression, lambda 0.5, gamma 1.5, beta 0.6 and alpha 0.01. Every one of those values is taken from the paper. Three seeds, paired.</w:t>
+      </w:r>
+    </w:p>
+    <w:tbl>
+      <w:tblPr>
+        <w:tblStyle w:val="TableGrid"/>
+        <w:tblW w:w="9020" w:type="dxa"/>
+      </w:tblPr>
+      <w:tblGrid>
+        <w:gridCol w:w="1503"/>
+        <w:gridCol w:w="1503"/>
+        <w:gridCol w:w="1503"/>
+        <w:gridCol w:w="1503"/>
+        <w:gridCol w:w="1503"/>
+        <w:gridCol w:w="1503"/>
+      </w:tblGrid>
+      <w:tr>
+        <w:tc>
+          <w:tcPr>
+            <w:tcW w:w="1503" w:type="dxa"/>
+            <w:shd w:val="clear" w:color="auto" w:fill="EDEDED"/>
+          </w:tcPr>
+          <w:p>
+            <w:pPr>
+              <w:spacing w:before="20" w:after="20"/>
+            </w:pPr>
+            <w:r>
+              <w:rPr>
+                <w:b/>
+                <w:sz w:val="17"/>
+              </w:rPr>
+              <w:t xml:space="preserve">Metric</w:t>
+            </w:r>
+          </w:p>
+        </w:tc>
+        <w:tc>
+          <w:tcPr>
+            <w:tcW w:w="1503" w:type="dxa"/>
+            <w:shd w:val="clear" w:color="auto" w:fill="EDEDED"/>
+          </w:tcPr>
+          <w:p>
+            <w:pPr>
+              <w:spacing w:before="20" w:after="20"/>
+            </w:pPr>
+            <w:r>
+              <w:rPr>
+                <w:b/>
+                <w:sz w:val="17"/>
+              </w:rPr>
+              <w:t xml:space="preserve">Direction</w:t>
+            </w:r>
+          </w:p>
+        </w:tc>
+        <w:tc>
+          <w:tcPr>
+            <w:tcW w:w="1503" w:type="dxa"/>
+            <w:shd w:val="clear" w:color="auto" w:fill="EDEDED"/>
+          </w:tcPr>
+          <w:p>
+            <w:pPr>
+              <w:spacing w:before="20" w:after="20"/>
+            </w:pPr>
+            <w:r>
+              <w:rPr>
+                <w:b/>
+                <w:sz w:val="17"/>
+              </w:rPr>
+              <w:t xml:space="preserve">PerMFL</w:t>
+            </w:r>
+          </w:p>
+        </w:tc>
+        <w:tc>
+          <w:tcPr>
+            <w:tcW w:w="1503" w:type="dxa"/>
+            <w:shd w:val="clear" w:color="auto" w:fill="EDEDED"/>
+          </w:tcPr>
+          <w:p>
+            <w:pPr>
+              <w:spacing w:before="20" w:after="20"/>
+            </w:pPr>
+            <w:r>
+              <w:rPr>
+                <w:b/>
+                <w:sz w:val="17"/>
+              </w:rPr>
+              <w:t xml:space="preserve">Fine Tuned</w:t>
+            </w:r>
+          </w:p>
+        </w:tc>
+        <w:tc>
+          <w:tcPr>
+            <w:tcW w:w="1503" w:type="dxa"/>
+            <w:shd w:val="clear" w:color="auto" w:fill="EDEDED"/>
+          </w:tcPr>
+          <w:p>
+            <w:pPr>
+              <w:spacing w:before="20" w:after="20"/>
+            </w:pPr>
+            <w:r>
+              <w:rPr>
+                <w:b/>
+                <w:sz w:val="17"/>
+              </w:rPr>
+              <w:t xml:space="preserve">Delta</w:t>
+            </w:r>
+          </w:p>
+        </w:tc>
+        <w:tc>
+          <w:tcPr>
+            <w:tcW w:w="1503" w:type="dxa"/>
+            <w:shd w:val="clear" w:color="auto" w:fill="EDEDED"/>
+          </w:tcPr>
+          <w:p>
+            <w:pPr>
+              <w:spacing w:before="20" w:after="20"/>
+            </w:pPr>
+            <w:r>
+              <w:rPr>
+                <w:b/>
+                <w:sz w:val="17"/>
+              </w:rPr>
+              <w:t xml:space="preserve">t</w:t>
+            </w:r>
+          </w:p>
+        </w:tc>
+      </w:tr>
+      <w:tr>
+        <w:tc>
+          <w:tcPr>
+            <w:tcW w:w="1503" w:type="dxa"/>
+          </w:tcPr>
+          <w:p>
+            <w:pPr>
+              <w:spacing w:before="20" w:after="20"/>
+            </w:pPr>
+            <w:r>
+              <w:rPr>
+                <w:sz w:val="17"/>
+              </w:rPr>
+              <w:t xml:space="preserve">Personalised macro F1</w:t>
+            </w:r>
+          </w:p>
+        </w:tc>
+        <w:tc>
+          <w:tcPr>
+            <w:tcW w:w="1503" w:type="dxa"/>
+          </w:tcPr>
+          <w:p>
+            <w:pPr>
+              <w:spacing w:before="20" w:after="20"/>
+            </w:pPr>
+            <w:r>
+              <w:rPr>
+                <w:sz w:val="17"/>
+              </w:rPr>
+              <w:t xml:space="preserve">higher better</w:t>
+            </w:r>
+          </w:p>
+        </w:tc>
+        <w:tc>
+          <w:tcPr>
+            <w:tcW w:w="1503" w:type="dxa"/>
+          </w:tcPr>
+          <w:p>
+            <w:pPr>
+              <w:spacing w:before="20" w:after="20"/>
+            </w:pPr>
+            <w:r>
+              <w:rPr>
+                <w:sz w:val="17"/>
+              </w:rPr>
+              <w:t xml:space="preserve">0.9787</w:t>
+            </w:r>
+          </w:p>
+        </w:tc>
+        <w:tc>
+          <w:tcPr>
+            <w:tcW w:w="1503" w:type="dxa"/>
+          </w:tcPr>
+          <w:p>
+            <w:pPr>
+              <w:spacing w:before="20" w:after="20"/>
+            </w:pPr>
+            <w:r>
+              <w:rPr>
+                <w:sz w:val="17"/>
+              </w:rPr>
+              <w:t xml:space="preserve">0.9786</w:t>
+            </w:r>
+          </w:p>
+        </w:tc>
+        <w:tc>
+          <w:tcPr>
+            <w:tcW w:w="1503" w:type="dxa"/>
+          </w:tcPr>
+          <w:p>
+            <w:pPr>
+              <w:spacing w:before="20" w:after="20"/>
+            </w:pPr>
+            <w:r>
+              <w:rPr>
+                <w:sz w:val="17"/>
+              </w:rPr>
+              <w:t xml:space="preserve">-0.0001</w:t>
+            </w:r>
+          </w:p>
+        </w:tc>
+        <w:tc>
+          <w:tcPr>
+            <w:tcW w:w="1503" w:type="dxa"/>
+          </w:tcPr>
+          <w:p>
+            <w:pPr>
+              <w:spacing w:before="20" w:after="20"/>
+            </w:pPr>
+            <w:r>
+              <w:rPr>
+                <w:sz w:val="17"/>
+              </w:rPr>
+              <w:t xml:space="preserve">-1.03</w:t>
+            </w:r>
+          </w:p>
+        </w:tc>
+      </w:tr>
+      <w:tr>
+        <w:tc>
+          <w:tcPr>
+            <w:tcW w:w="1503" w:type="dxa"/>
+          </w:tcPr>
+          <w:p>
+            <w:pPr>
+              <w:spacing w:before="20" w:after="20"/>
+            </w:pPr>
+            <w:r>
+              <w:rPr>
+                <w:sz w:val="17"/>
+              </w:rPr>
+              <w:t xml:space="preserve">Personalised accuracy</w:t>
+            </w:r>
+          </w:p>
+        </w:tc>
+        <w:tc>
+          <w:tcPr>
+            <w:tcW w:w="1503" w:type="dxa"/>
+          </w:tcPr>
+          <w:p>
+            <w:pPr>
+              <w:spacing w:before="20" w:after="20"/>
+            </w:pPr>
+            <w:r>
+              <w:rPr>
+                <w:sz w:val="17"/>
+              </w:rPr>
+              <w:t xml:space="preserve">higher better</w:t>
+            </w:r>
+          </w:p>
+        </w:tc>
+        <w:tc>
+          <w:tcPr>
+            <w:tcW w:w="1503" w:type="dxa"/>
+          </w:tcPr>
+          <w:p>
+            <w:pPr>
+              <w:spacing w:before="20" w:after="20"/>
+            </w:pPr>
+            <w:r>
+              <w:rPr>
+                <w:sz w:val="17"/>
+              </w:rPr>
+              <w:t xml:space="preserve">0.9796</w:t>
+            </w:r>
+          </w:p>
+        </w:tc>
+        <w:tc>
+          <w:tcPr>
+            <w:tcW w:w="1503" w:type="dxa"/>
+          </w:tcPr>
+          <w:p>
+            <w:pPr>
+              <w:spacing w:before="20" w:after="20"/>
+            </w:pPr>
+            <w:r>
+              <w:rPr>
+                <w:sz w:val="17"/>
+              </w:rPr>
+              <w:t xml:space="preserve">0.9795</w:t>
+            </w:r>
+          </w:p>
+        </w:tc>
+        <w:tc>
+          <w:tcPr>
+            <w:tcW w:w="1503" w:type="dxa"/>
+          </w:tcPr>
+          <w:p>
+            <w:pPr>
+              <w:spacing w:before="20" w:after="20"/>
+            </w:pPr>
+            <w:r>
+              <w:rPr>
+                <w:sz w:val="17"/>
+              </w:rPr>
+              <w:t xml:space="preserve">-0.0001</w:t>
+            </w:r>
+          </w:p>
+        </w:tc>
+        <w:tc>
+          <w:tcPr>
+            <w:tcW w:w="1503" w:type="dxa"/>
+          </w:tcPr>
+          <w:p>
+            <w:pPr>
+              <w:spacing w:before="20" w:after="20"/>
+            </w:pPr>
+            <w:r>
+              <w:rPr>
+                <w:sz w:val="17"/>
+              </w:rPr>
+              <w:t xml:space="preserve">-0.65</w:t>
+            </w:r>
+          </w:p>
+        </w:tc>
+      </w:tr>
+      <w:tr>
+        <w:tc>
+          <w:tcPr>
+            <w:tcW w:w="1503" w:type="dxa"/>
+          </w:tcPr>
+          <w:p>
+            <w:pPr>
+              <w:spacing w:before="20" w:after="20"/>
+            </w:pPr>
+            <w:r>
+              <w:rPr>
+                <w:sz w:val="17"/>
+              </w:rPr>
+              <w:t xml:space="preserve">Global macro F1</w:t>
+            </w:r>
+          </w:p>
+        </w:tc>
+        <w:tc>
+          <w:tcPr>
+            <w:tcW w:w="1503" w:type="dxa"/>
+          </w:tcPr>
+          <w:p>
+            <w:pPr>
+              <w:spacing w:before="20" w:after="20"/>
+            </w:pPr>
+            <w:r>
+              <w:rPr>
+                <w:sz w:val="17"/>
+              </w:rPr>
+              <w:t xml:space="preserve">higher better</w:t>
+            </w:r>
+          </w:p>
+        </w:tc>
+        <w:tc>
+          <w:tcPr>
+            <w:tcW w:w="1503" w:type="dxa"/>
+          </w:tcPr>
+          <w:p>
+            <w:pPr>
+              <w:spacing w:before="20" w:after="20"/>
+            </w:pPr>
+            <w:r>
+              <w:rPr>
+                <w:sz w:val="17"/>
+              </w:rPr>
+              <w:t xml:space="preserve">0.9018</w:t>
+            </w:r>
+          </w:p>
+        </w:tc>
+        <w:tc>
+          <w:tcPr>
+            <w:tcW w:w="1503" w:type="dxa"/>
+          </w:tcPr>
+          <w:p>
+            <w:pPr>
+              <w:spacing w:before="20" w:after="20"/>
+            </w:pPr>
+            <w:r>
+              <w:rPr>
+                <w:sz w:val="17"/>
+              </w:rPr>
+              <w:t xml:space="preserve">0.9176</w:t>
+            </w:r>
+          </w:p>
+        </w:tc>
+        <w:tc>
+          <w:tcPr>
+            <w:tcW w:w="1503" w:type="dxa"/>
+          </w:tcPr>
+          <w:p>
+            <w:pPr>
+              <w:spacing w:before="20" w:after="20"/>
+            </w:pPr>
+            <w:r>
+              <w:rPr>
+                <w:sz w:val="17"/>
+              </w:rPr>
+              <w:t xml:space="preserve">+0.0158</w:t>
+            </w:r>
+          </w:p>
+        </w:tc>
+        <w:tc>
+          <w:tcPr>
+            <w:tcW w:w="1503" w:type="dxa"/>
+          </w:tcPr>
+          <w:p>
+            <w:pPr>
+              <w:spacing w:before="20" w:after="20"/>
+            </w:pPr>
+            <w:r>
+              <w:rPr>
+                <w:sz w:val="17"/>
+              </w:rPr>
+              <w:t xml:space="preserve">33.35</w:t>
+            </w:r>
+          </w:p>
+        </w:tc>
+      </w:tr>
+      <w:tr>
+        <w:tc>
+          <w:tcPr>
+            <w:tcW w:w="1503" w:type="dxa"/>
+          </w:tcPr>
+          <w:p>
+            <w:pPr>
+              <w:spacing w:before="20" w:after="20"/>
+            </w:pPr>
+            <w:r>
+              <w:rPr>
+                <w:sz w:val="17"/>
+              </w:rPr>
+              <w:t xml:space="preserve">Global accuracy</w:t>
+            </w:r>
+          </w:p>
+        </w:tc>
+        <w:tc>
+          <w:tcPr>
+            <w:tcW w:w="1503" w:type="dxa"/>
+          </w:tcPr>
+          <w:p>
+            <w:pPr>
+              <w:spacing w:before="20" w:after="20"/>
+            </w:pPr>
+            <w:r>
+              <w:rPr>
+                <w:sz w:val="17"/>
+              </w:rPr>
+              <w:t xml:space="preserve">higher better</w:t>
+            </w:r>
+          </w:p>
+        </w:tc>
+        <w:tc>
+          <w:tcPr>
+            <w:tcW w:w="1503" w:type="dxa"/>
+          </w:tcPr>
+          <w:p>
+            <w:pPr>
+              <w:spacing w:before="20" w:after="20"/>
+            </w:pPr>
+            <w:r>
+              <w:rPr>
+                <w:sz w:val="17"/>
+              </w:rPr>
+              <w:t xml:space="preserve">0.9053</w:t>
+            </w:r>
+          </w:p>
+        </w:tc>
+        <w:tc>
+          <w:tcPr>
+            <w:tcW w:w="1503" w:type="dxa"/>
+          </w:tcPr>
+          <w:p>
+            <w:pPr>
+              <w:spacing w:before="20" w:after="20"/>
+            </w:pPr>
+            <w:r>
+              <w:rPr>
+                <w:sz w:val="17"/>
+              </w:rPr>
+              <w:t xml:space="preserve">0.9206</w:t>
+            </w:r>
+          </w:p>
+        </w:tc>
+        <w:tc>
+          <w:tcPr>
+            <w:tcW w:w="1503" w:type="dxa"/>
+          </w:tcPr>
+          <w:p>
+            <w:pPr>
+              <w:spacing w:before="20" w:after="20"/>
+            </w:pPr>
+            <w:r>
+              <w:rPr>
+                <w:sz w:val="17"/>
+              </w:rPr>
+              <w:t xml:space="preserve">+0.0152</w:t>
+            </w:r>
+          </w:p>
+        </w:tc>
+        <w:tc>
+          <w:tcPr>
+            <w:tcW w:w="1503" w:type="dxa"/>
+          </w:tcPr>
+          <w:p>
+            <w:pPr>
+              <w:spacing w:before="20" w:after="20"/>
+            </w:pPr>
+            <w:r>
+              <w:rPr>
+                <w:sz w:val="17"/>
+              </w:rPr>
+              <w:t xml:space="preserve">39.38</w:t>
+            </w:r>
+          </w:p>
+        </w:tc>
+      </w:tr>
+      <w:tr>
+        <w:tc>
+          <w:tcPr>
+            <w:tcW w:w="1503" w:type="dxa"/>
+          </w:tcPr>
+          <w:p>
+            <w:pPr>
+              <w:spacing w:before="20" w:after="20"/>
+            </w:pPr>
+            <w:r>
+              <w:rPr>
+                <w:sz w:val="17"/>
+              </w:rPr>
+              <w:t xml:space="preserve">Global macro recall</w:t>
+            </w:r>
+          </w:p>
+        </w:tc>
+        <w:tc>
+          <w:tcPr>
+            <w:tcW w:w="1503" w:type="dxa"/>
+          </w:tcPr>
+          <w:p>
+            <w:pPr>
+              <w:spacing w:before="20" w:after="20"/>
+            </w:pPr>
+            <w:r>
+              <w:rPr>
+                <w:sz w:val="17"/>
+              </w:rPr>
+              <w:t xml:space="preserve">higher better</w:t>
+            </w:r>
+          </w:p>
+        </w:tc>
+        <w:tc>
+          <w:tcPr>
+            <w:tcW w:w="1503" w:type="dxa"/>
+          </w:tcPr>
+          <w:p>
+            <w:pPr>
+              <w:spacing w:before="20" w:after="20"/>
+            </w:pPr>
+            <w:r>
+              <w:rPr>
+                <w:sz w:val="17"/>
+              </w:rPr>
+              <w:t xml:space="preserve">0.9022</w:t>
+            </w:r>
+          </w:p>
+        </w:tc>
+        <w:tc>
+          <w:tcPr>
+            <w:tcW w:w="1503" w:type="dxa"/>
+          </w:tcPr>
+          <w:p>
+            <w:pPr>
+              <w:spacing w:before="20" w:after="20"/>
+            </w:pPr>
+            <w:r>
+              <w:rPr>
+                <w:sz w:val="17"/>
+              </w:rPr>
+              <w:t xml:space="preserve">0.9180</w:t>
+            </w:r>
+          </w:p>
+        </w:tc>
+        <w:tc>
+          <w:tcPr>
+            <w:tcW w:w="1503" w:type="dxa"/>
+          </w:tcPr>
+          <w:p>
+            <w:pPr>
+              <w:spacing w:before="20" w:after="20"/>
+            </w:pPr>
+            <w:r>
+              <w:rPr>
+                <w:sz w:val="17"/>
+              </w:rPr>
+              <w:t xml:space="preserve">+0.0158</w:t>
+            </w:r>
+          </w:p>
+        </w:tc>
+        <w:tc>
+          <w:tcPr>
+            <w:tcW w:w="1503" w:type="dxa"/>
+          </w:tcPr>
+          <w:p>
+            <w:pPr>
+              <w:spacing w:before="20" w:after="20"/>
+            </w:pPr>
+            <w:r>
+              <w:rPr>
+                <w:sz w:val="17"/>
+              </w:rPr>
+              <w:t xml:space="preserve">42.39</w:t>
+            </w:r>
+          </w:p>
+        </w:tc>
+      </w:tr>
+      <w:tr>
+        <w:tc>
+          <w:tcPr>
+            <w:tcW w:w="1503" w:type="dxa"/>
+          </w:tcPr>
+          <w:p>
+            <w:pPr>
+              <w:spacing w:before="20" w:after="20"/>
+            </w:pPr>
+            <w:r>
+              <w:rPr>
+                <w:sz w:val="17"/>
+              </w:rPr>
+              <w:t xml:space="preserve">Global macro FPR</w:t>
+            </w:r>
+          </w:p>
+        </w:tc>
+        <w:tc>
+          <w:tcPr>
+            <w:tcW w:w="1503" w:type="dxa"/>
+          </w:tcPr>
+          <w:p>
+            <w:pPr>
+              <w:spacing w:before="20" w:after="20"/>
+            </w:pPr>
+            <w:r>
+              <w:rPr>
+                <w:sz w:val="17"/>
+              </w:rPr>
+              <w:t xml:space="preserve">lower better</w:t>
+            </w:r>
+          </w:p>
+        </w:tc>
+        <w:tc>
+          <w:tcPr>
+            <w:tcW w:w="1503" w:type="dxa"/>
+          </w:tcPr>
+          <w:p>
+            <w:pPr>
+              <w:spacing w:before="20" w:after="20"/>
+            </w:pPr>
+            <w:r>
+              <w:rPr>
+                <w:sz w:val="17"/>
+              </w:rPr>
+              <w:t xml:space="preserve">0.0105</w:t>
+            </w:r>
+          </w:p>
+        </w:tc>
+        <w:tc>
+          <w:tcPr>
+            <w:tcW w:w="1503" w:type="dxa"/>
+          </w:tcPr>
+          <w:p>
+            <w:pPr>
+              <w:spacing w:before="20" w:after="20"/>
+            </w:pPr>
+            <w:r>
+              <w:rPr>
+                <w:sz w:val="17"/>
+              </w:rPr>
+              <w:t xml:space="preserve">0.0088</w:t>
+            </w:r>
+          </w:p>
+        </w:tc>
+        <w:tc>
+          <w:tcPr>
+            <w:tcW w:w="1503" w:type="dxa"/>
+          </w:tcPr>
+          <w:p>
+            <w:pPr>
+              <w:spacing w:before="20" w:after="20"/>
+            </w:pPr>
+            <w:r>
+              <w:rPr>
+                <w:sz w:val="17"/>
+              </w:rPr>
+              <w:t xml:space="preserve">-0.0017</w:t>
+            </w:r>
+          </w:p>
+        </w:tc>
+        <w:tc>
+          <w:tcPr>
+            <w:tcW w:w="1503" w:type="dxa"/>
+          </w:tcPr>
+          <w:p>
+            <w:pPr>
+              <w:spacing w:before="20" w:after="20"/>
+            </w:pPr>
+            <w:r>
+              <w:rPr>
+                <w:sz w:val="17"/>
+              </w:rPr>
+              <w:t xml:space="preserve">-41.19</w:t>
+            </w:r>
+          </w:p>
+        </w:tc>
+      </w:tr>
+    </w:tbl>
+    <w:p/>
+    <w:p>
+      <w:pPr/>
+      <w:r>
+        <w:t xml:space="preserve">The critical value at two degrees of freedom is 4.303. The four global metrics clear it by an order of magnitude and win on every seed. The three personalised metrics do not clear it, and their deltas are negative here where they were marginally positive at a shorter horizon. The correct reading is that the personalised model is unaffected, which is what the update rules predict, since the separated parameter enters only the team update.</w:t>
+      </w:r>
+    </w:p>
+    <w:p>
+      <w:pPr/>
+      <w:r>
+        <w:t xml:space="preserve">The published figures for this cell are 96.49 personalised accuracy and 91.68 global accuracy. Measured against the latter:</w:t>
+      </w:r>
+    </w:p>
+    <w:tbl>
+      <w:tblPr>
+        <w:tblStyle w:val="TableGrid"/>
+        <w:tblW w:w="9020" w:type="dxa"/>
+      </w:tblPr>
+      <w:tblGrid>
+        <w:gridCol w:w="2255"/>
+        <w:gridCol w:w="2255"/>
+        <w:gridCol w:w="2255"/>
+        <w:gridCol w:w="2255"/>
+      </w:tblGrid>
+      <w:tr>
+        <w:tc>
+          <w:tcPr>
+            <w:tcW w:w="2255" w:type="dxa"/>
+            <w:shd w:val="clear" w:color="auto" w:fill="EDEDED"/>
+          </w:tcPr>
+          <w:p>
+            <w:pPr>
+              <w:spacing w:before="20" w:after="20"/>
+            </w:pPr>
+            <w:r>
+              <w:rPr>
+                <w:b/>
+                <w:sz w:val="17"/>
+              </w:rPr>
+              <w:t xml:space="preserve">Configuration</w:t>
+            </w:r>
+          </w:p>
+        </w:tc>
+        <w:tc>
+          <w:tcPr>
+            <w:tcW w:w="2255" w:type="dxa"/>
+            <w:shd w:val="clear" w:color="auto" w:fill="EDEDED"/>
+          </w:tcPr>
+          <w:p>
+            <w:pPr>
+              <w:spacing w:before="20" w:after="20"/>
+            </w:pPr>
+            <w:r>
+              <w:rPr>
+                <w:b/>
+                <w:sz w:val="17"/>
+              </w:rPr>
+              <w:t xml:space="preserve">Global accuracy by seed</w:t>
+            </w:r>
+          </w:p>
+        </w:tc>
+        <w:tc>
+          <w:tcPr>
+            <w:tcW w:w="2255" w:type="dxa"/>
+            <w:shd w:val="clear" w:color="auto" w:fill="EDEDED"/>
+          </w:tcPr>
+          <w:p>
+            <w:pPr>
+              <w:spacing w:before="20" w:after="20"/>
+            </w:pPr>
+            <w:r>
+              <w:rPr>
+                <w:b/>
+                <w:sz w:val="17"/>
+              </w:rPr>
+              <w:t xml:space="preserve">Mean</w:t>
+            </w:r>
+          </w:p>
+        </w:tc>
+        <w:tc>
+          <w:tcPr>
+            <w:tcW w:w="2255" w:type="dxa"/>
+            <w:shd w:val="clear" w:color="auto" w:fill="EDEDED"/>
+          </w:tcPr>
+          <w:p>
+            <w:pPr>
+              <w:spacing w:before="20" w:after="20"/>
+            </w:pPr>
+            <w:r>
+              <w:rPr>
+                <w:b/>
+                <w:sz w:val="17"/>
+              </w:rPr>
+              <w:t xml:space="preserve">Versus 91.68</w:t>
+            </w:r>
+          </w:p>
+        </w:tc>
+      </w:tr>
+      <w:tr>
+        <w:tc>
+          <w:tcPr>
+            <w:tcW w:w="2255" w:type="dxa"/>
+          </w:tcPr>
+          <w:p>
+            <w:pPr>
+              <w:spacing w:before="20" w:after="20"/>
+            </w:pPr>
+            <w:r>
+              <w:rPr>
+                <w:sz w:val="17"/>
+              </w:rPr>
+              <w:t xml:space="preserve">PerMFL</w:t>
+            </w:r>
+          </w:p>
+        </w:tc>
+        <w:tc>
+          <w:tcPr>
+            <w:tcW w:w="2255" w:type="dxa"/>
+          </w:tcPr>
+          <w:p>
+            <w:pPr>
+              <w:spacing w:before="20" w:after="20"/>
+            </w:pPr>
+            <w:r>
+              <w:rPr>
+                <w:sz w:val="17"/>
+              </w:rPr>
+              <w:t xml:space="preserve">90.45, 90.65, 90.51</w:t>
+            </w:r>
+          </w:p>
+        </w:tc>
+        <w:tc>
+          <w:tcPr>
+            <w:tcW w:w="2255" w:type="dxa"/>
+          </w:tcPr>
+          <w:p>
+            <w:pPr>
+              <w:spacing w:before="20" w:after="20"/>
+            </w:pPr>
+            <w:r>
+              <w:rPr>
+                <w:sz w:val="17"/>
+              </w:rPr>
+              <w:t xml:space="preserve">90.53</w:t>
+            </w:r>
+          </w:p>
+        </w:tc>
+        <w:tc>
+          <w:tcPr>
+            <w:tcW w:w="2255" w:type="dxa"/>
+          </w:tcPr>
+          <w:p>
+            <w:pPr>
+              <w:spacing w:before="20" w:after="20"/>
+            </w:pPr>
+            <w:r>
+              <w:rPr>
+                <w:sz w:val="17"/>
+              </w:rPr>
+              <w:t xml:space="preserve">-1.15, exceeds on none</w:t>
+            </w:r>
+          </w:p>
+        </w:tc>
+      </w:tr>
+      <w:tr>
+        <w:tc>
+          <w:tcPr>
+            <w:tcW w:w="2255" w:type="dxa"/>
+          </w:tcPr>
+          <w:p>
+            <w:pPr>
+              <w:spacing w:before="20" w:after="20"/>
+            </w:pPr>
+            <w:r>
+              <w:rPr>
+                <w:sz w:val="17"/>
+              </w:rPr>
+              <w:t xml:space="preserve">Fine Tuned</w:t>
+            </w:r>
+          </w:p>
+        </w:tc>
+        <w:tc>
+          <w:tcPr>
+            <w:tcW w:w="2255" w:type="dxa"/>
+          </w:tcPr>
+          <w:p>
+            <w:pPr>
+              <w:spacing w:before="20" w:after="20"/>
+            </w:pPr>
+            <w:r>
+              <w:rPr>
+                <w:sz w:val="17"/>
+              </w:rPr>
+              <w:t xml:space="preserve">92.03, 92.09, 92.05</w:t>
+            </w:r>
+          </w:p>
+        </w:tc>
+        <w:tc>
+          <w:tcPr>
+            <w:tcW w:w="2255" w:type="dxa"/>
+          </w:tcPr>
+          <w:p>
+            <w:pPr>
+              <w:spacing w:before="20" w:after="20"/>
+            </w:pPr>
+            <w:r>
+              <w:rPr>
+                <w:sz w:val="17"/>
+              </w:rPr>
+              <w:t xml:space="preserve">92.06</w:t>
+            </w:r>
+          </w:p>
+        </w:tc>
+        <w:tc>
+          <w:tcPr>
+            <w:tcW w:w="2255" w:type="dxa"/>
+          </w:tcPr>
+          <w:p>
+            <w:pPr>
+              <w:spacing w:before="20" w:after="20"/>
+            </w:pPr>
+            <w:r>
+              <w:rPr>
+                <w:sz w:val="17"/>
+              </w:rPr>
+              <w:t xml:space="preserve">+0.38, exceeds on all three</w:t>
+            </w:r>
+          </w:p>
+        </w:tc>
+      </w:tr>
+    </w:tbl>
+    <w:p/>
+    <w:p>
+      <w:pPr/>
+      <w:r>
+        <w:t xml:space="preserve">The two arms do not overlap and fall either side of the published number. Both have converged: over the final fifty rounds the global model gains 0.0048 points per round under the published coupling and 0.0019 under the separated one, so the remaining difference is not an artefact of stopping early.</w:t>
+      </w:r>
+    </w:p>
+    <w:p>
+      <w:pPr/>
+      <w:r>
+        <w:t xml:space="preserve">The claim this supports is narrow and worth stating precisely. Under the paper's own configuration, at a horizon where both arms have converged, separating the two roles of lambda reaches the published global accuracy on every seed while the published coupling reaches it on none. It does not support the broader claim that the method has been beaten, because the paper reports one figure per cell without stating whether it is a final or a best value, and the comparison here uses a peak.</w:t>
+      </w:r>
+    </w:p>
+    <w:p>
+      <w:pPr/>
+      <w:r>
+        <w:t xml:space="preserve">The size of the gain depends on the horizon. At one hundred global rounds the global accuracy gain is 0.0418; at four hundred it is 0.0152. Longer training lets the published coupling recover much of the deficit unaided, but not all of it. The correction therefore buys both faster convergence and a better converged model, and the first effect is the larger of the two.</w:t>
       </w:r>
     </w:p>
     <w:p>

</xml_diff>

<commit_message>
Normalise the arm names throughout the draft
The draft mixed two vocabularies: the new paper-configuration section
used PerMFL and Fine Tuned while older sections said shipped and
decoupled. Thirteen replacements, distinguishing the two senses: uses
naming an experimental arm become PerMFL or Fine Tuned, while uses
meaning the released code become released or published.

Co-Authored-By: Claude Opus 5 <noreply@anthropic.com>
</commit_message>
<xml_diff>
--- a/report/PerMFL_report_alt_full.docx
+++ b/report/PerMFL_report_alt_full.docx
@@ -2153,7 +2153,7 @@
         <w:t xml:space="preserve">N4 Backward compatibility.</w:t>
       </w:r>
       <w:r>
-        <w:t xml:space="preserve">  Every modification defaults to the shipped</w:t>
+        <w:t xml:space="preserve">  Every modification defaults to the released</w:t>
       </w:r>
     </w:p>
     <w:p>
@@ -2830,7 +2830,7 @@
     <w:p>
       <w:pPr/>
       <w:r>
-        <w:t xml:space="preserve">Four changes were made, each defaulting to the shipped behaviour.</w:t>
+        <w:t xml:space="preserve">Four changes were made, each defaulting to the released behaviour.</w:t>
       </w:r>
     </w:p>
     <w:p>
@@ -3833,7 +3833,7 @@
     <w:p>
       <w:pPr/>
       <w:r>
-        <w:t xml:space="preserve">The two roles want opposite values. Personalisation wants $\lambda$ small; a functional global model wants it comparable to $\gamma$. The shipped parameterisation forces a choice.</w:t>
+        <w:t xml:space="preserve">The two roles want opposite values. Personalisation wants $\lambda$ small; a functional global model wants it comparable to $\gamma$. The published parameterisation forces a choice.</w:t>
       </w:r>
     </w:p>
     <w:p>
@@ -3913,7 +3913,7 @@
                 <w:b/>
                 <w:sz w:val="17"/>
               </w:rPr>
-              <w:t xml:space="preserve">shipped</w:t>
+              <w:t xml:space="preserve">PerMFL</w:t>
             </w:r>
           </w:p>
         </w:tc>
@@ -3931,7 +3931,7 @@
                 <w:b/>
                 <w:sz w:val="17"/>
               </w:rPr>
-              <w:t xml:space="preserve">decoupled</w:t>
+              <w:t xml:space="preserve">Fine Tuned</w:t>
             </w:r>
           </w:p>
         </w:tc>
@@ -4305,7 +4305,7 @@
     <w:p>
       <w:pPr/>
       <w:r>
-        <w:t xml:space="preserve">All four exceed the critical value of 2.776 and win on every seed. The floors are 0.8171 accuracy and 0.0999 macro F1. The shipped global model sits below the accuracy floor; the decoupled one sits above it.</w:t>
+        <w:t xml:space="preserve">All four exceed the critical value of 2.776 and win on every seed. The floors are 0.8171 accuracy and 0.0999 macro F1. The PerMFL global model sits below the accuracy floor; the Fine Tuned one sits above it.</w:t>
       </w:r>
     </w:p>
     <w:p>
@@ -5359,7 +5359,7 @@
     <w:p>
       <w:pPr/>
       <w:r>
-        <w:t xml:space="preserve">The shipped global model varies between roughly 0.35 and 0.73 depending on initialisation. For a security product that is arguably the more consequential finding: an unpredictable detector cannot be operated against a threshold.</w:t>
+        <w:t xml:space="preserve">The PerMFL global model varies between roughly 0.35 and 0.73 depending on initialisation. For a security product that is arguably the more consequential finding: an unpredictable detector cannot be operated against a threshold.</w:t>
       </w:r>
     </w:p>
     <w:p>
@@ -6623,7 +6623,7 @@
     <w:p>
       <w:pPr/>
       <w:r>
-        <w:t xml:space="preserve">At the least skewed CICIDS setting the decoupled configuration reaches 0.8432 personalised and 0.8546 global macro F1 against a ceiling of 1.0, compared with 0.5176 and 0.1497 for the shipped configuration.</w:t>
+        <w:t xml:space="preserve">At the least skewed CICIDS setting the Fine Tuned configuration reaches 0.8432 personalised and 0.8546 global macro F1 against a ceiling of 1.0, compared with 0.5176 and 0.1497 for the PerMFL configuration.</w:t>
       </w:r>
     </w:p>
     <w:p>
@@ -6641,7 +6641,7 @@
     <w:p>
       <w:pPr/>
       <w:r>
-        <w:t xml:space="preserve">One configuration goes the other way. Under attack-domain partitioning on TON-IoT, at the highest heterogeneity measured anywhere in the study, the global macro F1 falls from 0.0917 to 0.0403, $t = -6.21$, losing on all five seeds. The decoupled global accuracy is 0.2369 with a standard deviation of zero, which is exactly the majority-class rate: the model collapsed to predicting normal traffic.</w:t>
+        <w:t xml:space="preserve">One configuration goes the other way. Under attack-domain partitioning on TON-IoT, at the highest heterogeneity measured anywhere in the study, the global macro F1 falls from 0.0917 to 0.0403, $t = -6.21$, losing on all five seeds. The Fine Tuned global accuracy is 0.2369 with a standard deviation of zero, which is exactly the majority-class rate: the model collapsed to predicting normal traffic.</w:t>
       </w:r>
     </w:p>
     <w:p>
@@ -6673,7 +6673,7 @@
     <w:p>
       <w:pPr/>
       <w:r>
-        <w:t xml:space="preserve">The honest conclusion is that federated personalisation does not pay on this data, and that the value of the method lies in its global model. That makes the finding in Section~(see above) more consequential rather than less: the shipped parameterisation cripples precisely the component that justifies federating.</w:t>
+        <w:t xml:space="preserve">The honest conclusion is that federated personalisation does not pay on this data, and that the value of the method lies in its global model. That makes the finding in Section~(see above) more consequential rather than less: the published parameterisation cripples precisely the component that justifies federating.</w:t>
       </w:r>
     </w:p>
     <w:p>
@@ -6726,7 +6726,7 @@
     <w:p>
       <w:pPr/>
       <w:r>
-        <w:t xml:space="preserve">The baselines shipped with the base implementation were not run on the intrusion detection data. Only the method under test carries the metric instrumentation this study requires, and extending it to the others was not completed. The consequence is that the results position PerMFL against its own configurations and against local training, not against the federated literature.</w:t>
+        <w:t xml:space="preserve">The baselines released with the base implementation were not run on the intrusion detection data. Only the method under test carries the metric instrumentation this study requires, and extending it to the others was not completed. The consequence is that the results position PerMFL against its own configurations and against local training, not against the federated literature.</w:t>
       </w:r>
     </w:p>
     <w:p>
@@ -6936,7 +6936,7 @@
     <w:p>
       <w:pPr/>
       <w:r>
-        <w:t xml:space="preserve">Instrumenting the shipped baselines with the same metrics and running them on the same partitions would place the corrected method in context. This is the most valuable remaining work and it needs no new ideas, only the same instrumentation applied to four more server classes.</w:t>
+        <w:t xml:space="preserve">Instrumenting the released baselines with the same metrics and running them on the same partitions would place the corrected method in context. This is the most valuable remaining work and it needs no new ideas, only the same instrumentation applied to four more server classes.</w:t>
       </w:r>
     </w:p>
     <w:p>
@@ -6948,7 +6948,7 @@
           <w:b/>
           <w:i/>
         </w:rPr>
-        <w:t xml:space="preserve">Tuning the decoupled weight</w:t>
+        <w:t xml:space="preserve">Tuning the separated weight</w:t>
       </w:r>
     </w:p>
     <w:p>

</xml_diff>

<commit_message>
Rename the variant to Split-λ; add concepts and glossary; simplify code flow
Renames Fine Tuned to Split-λ across every document, figure and the Word
draft. Fine Tuned was wrong: no pretrained model is adapted and the value
is set before training. Split-λ states what happens, a derived
coefficient separated from its source parameter.

Adds docs/concepts.md: what the project does in machine learning terms,
with a glossary of 45 terms where any term used inside a definition is
itself defined.

Rewrites docs/code-flow.md at a higher level. No code is reproduced;
every step names file and line. Adds an ASCII flow of the three nested
loops and a side-by-side of PerMFL against Split-λ.

Both Word documents rebuilt; all five embedded figures verified by hash
against the freshly generated PNGs.

Co-Authored-By: Claude Opus 5 <noreply@anthropic.com>
</commit_message>
<xml_diff>
--- a/report/PerMFL_report_alt_full.docx
+++ b/report/PerMFL_report_alt_full.docx
@@ -3931,7 +3931,7 @@
                 <w:b/>
                 <w:sz w:val="17"/>
               </w:rPr>
-              <w:t xml:space="preserve">Fine Tuned</w:t>
+              <w:t xml:space="preserve">Split-λ</w:t>
             </w:r>
           </w:p>
         </w:tc>
@@ -4305,7 +4305,7 @@
     <w:p>
       <w:pPr/>
       <w:r>
-        <w:t xml:space="preserve">All four exceed the critical value of 2.776 and win on every seed. The floors are 0.8171 accuracy and 0.0999 macro F1. The PerMFL global model sits below the accuracy floor; the Fine Tuned one sits above it.</w:t>
+        <w:t xml:space="preserve">All four exceed the critical value of 2.776 and win on every seed. The floors are 0.8171 accuracy and 0.0999 macro F1. The PerMFL global model sits below the accuracy floor; the Split-λ one sits above it.</w:t>
       </w:r>
     </w:p>
     <w:p>
@@ -4462,7 +4462,7 @@
                 <w:b/>
                 <w:sz w:val="17"/>
               </w:rPr>
-              <w:t xml:space="preserve">Fine Tuned</w:t>
+              <w:t xml:space="preserve">Split-λ</w:t>
             </w:r>
           </w:p>
         </w:tc>
@@ -5269,7 +5269,7 @@
               <w:rPr>
                 <w:sz w:val="17"/>
               </w:rPr>
-              <w:t xml:space="preserve">Fine Tuned</w:t>
+              <w:t xml:space="preserve">Split-λ</w:t>
             </w:r>
           </w:p>
         </w:tc>
@@ -6623,7 +6623,7 @@
     <w:p>
       <w:pPr/>
       <w:r>
-        <w:t xml:space="preserve">At the least skewed CICIDS setting the Fine Tuned configuration reaches 0.8432 personalised and 0.8546 global macro F1 against a ceiling of 1.0, compared with 0.5176 and 0.1497 for the PerMFL configuration.</w:t>
+        <w:t xml:space="preserve">At the least skewed CICIDS setting the Split-λ configuration reaches 0.8432 personalised and 0.8546 global macro F1 against a ceiling of 1.0, compared with 0.5176 and 0.1497 for the PerMFL configuration.</w:t>
       </w:r>
     </w:p>
     <w:p>
@@ -6641,7 +6641,7 @@
     <w:p>
       <w:pPr/>
       <w:r>
-        <w:t xml:space="preserve">One configuration goes the other way. Under attack-domain partitioning on TON-IoT, at the highest heterogeneity measured anywhere in the study, the global macro F1 falls from 0.0917 to 0.0403, $t = -6.21$, losing on all five seeds. The Fine Tuned global accuracy is 0.2369 with a standard deviation of zero, which is exactly the majority-class rate: the model collapsed to predicting normal traffic.</w:t>
+        <w:t xml:space="preserve">One configuration goes the other way. Under attack-domain partitioning on TON-IoT, at the highest heterogeneity measured anywhere in the study, the global macro F1 falls from 0.0917 to 0.0403, $t = -6.21$, losing on all five seeds. The Split-λ global accuracy is 0.2369 with a standard deviation of zero, which is exactly the majority-class rate: the model collapsed to predicting normal traffic.</w:t>
       </w:r>
     </w:p>
     <w:p>

</xml_diff>

<commit_message>
Update the draft with the converged results and the three new findings
Replaces the CICIDS headline with the five-seed converged figures and
rewrites the TON-IoT passage: the regression reversed at a converged
horizon and is now reported as an artefact, with the reason, rather than
as a bound on the claim.

Adds two sections: the lambda_team sweep with per-class detection at
three operating points, and the two mechanisms that did not help, the
gated clustering trigger and the class-weighted loss.

Draft is 10,910 words with five figures.

Co-Authored-By: Claude Opus 5 <noreply@anthropic.com>
</commit_message>
<xml_diff>
--- a/report/PerMFL_report_alt_full.docx
+++ b/report/PerMFL_report_alt_full.docx
@@ -4001,7 +4001,7 @@
               <w:rPr>
                 <w:sz w:val="17"/>
               </w:rPr>
-              <w:t xml:space="preserve">0.2809 pm 0.0017</w:t>
+              <w:t xml:space="preserve">0.4182 pm 0.0364</w:t>
             </w:r>
           </w:p>
         </w:tc>
@@ -4017,7 +4017,7 @@
               <w:rPr>
                 <w:sz w:val="17"/>
               </w:rPr>
-              <w:t xml:space="preserve">0.3154 pm 0.0044</w:t>
+              <w:t xml:space="preserve">0.5086 pm 0.0168</w:t>
             </w:r>
           </w:p>
         </w:tc>
@@ -4033,7 +4033,7 @@
               <w:rPr>
                 <w:sz w:val="17"/>
               </w:rPr>
-              <w:t xml:space="preserve">+0.0346</w:t>
+              <w:t xml:space="preserve">+0.0904</w:t>
             </w:r>
           </w:p>
         </w:tc>
@@ -4049,7 +4049,7 @@
               <w:rPr>
                 <w:sz w:val="17"/>
               </w:rPr>
-              <w:t xml:space="preserve">21.25</w:t>
+              <w:t xml:space="preserve">4.29</w:t>
             </w:r>
           </w:p>
         </w:tc>
@@ -4083,7 +4083,7 @@
               <w:rPr>
                 <w:sz w:val="17"/>
               </w:rPr>
-              <w:t xml:space="preserve">0.7842 pm 0.0062</w:t>
+              <w:t xml:space="preserve">0.8390 pm 0.0081</w:t>
             </w:r>
           </w:p>
         </w:tc>
@@ -4099,7 +4099,7 @@
               <w:rPr>
                 <w:sz w:val="17"/>
               </w:rPr>
-              <w:t xml:space="preserve">0.8161 pm 0.0042</w:t>
+              <w:t xml:space="preserve">0.9041 pm 0.0107</w:t>
             </w:r>
           </w:p>
         </w:tc>
@@ -4115,7 +4115,7 @@
               <w:rPr>
                 <w:sz w:val="17"/>
               </w:rPr>
-              <w:t xml:space="preserve">+0.0320</w:t>
+              <w:t xml:space="preserve">+0.0651</w:t>
             </w:r>
           </w:p>
         </w:tc>
@@ -4131,7 +4131,7 @@
               <w:rPr>
                 <w:sz w:val="17"/>
               </w:rPr>
-              <w:t xml:space="preserve">10.61</w:t>
+              <w:t xml:space="preserve">9.28</w:t>
             </w:r>
           </w:p>
         </w:tc>
@@ -4165,7 +4165,7 @@
               <w:rPr>
                 <w:sz w:val="17"/>
               </w:rPr>
-              <w:t xml:space="preserve">0.1139 pm 0.0346</w:t>
+              <w:t xml:space="preserve">0.1165 pm 0.0178</w:t>
             </w:r>
           </w:p>
         </w:tc>
@@ -4181,7 +4181,7 @@
               <w:rPr>
                 <w:sz w:val="17"/>
               </w:rPr>
-              <w:t xml:space="preserve">0.2155 pm 0.0187</w:t>
+              <w:t xml:space="preserve">0.2457 pm 0.0064</w:t>
             </w:r>
           </w:p>
         </w:tc>
@@ -4197,7 +4197,7 @@
               <w:rPr>
                 <w:sz w:val="17"/>
               </w:rPr>
-              <w:t xml:space="preserve">+0.1016</w:t>
+              <w:t xml:space="preserve">+0.1292</w:t>
             </w:r>
           </w:p>
         </w:tc>
@@ -4213,7 +4213,7 @@
               <w:rPr>
                 <w:sz w:val="17"/>
               </w:rPr>
-              <w:t xml:space="preserve">4.35</w:t>
+              <w:t xml:space="preserve">15.68</w:t>
             </w:r>
           </w:p>
         </w:tc>
@@ -4247,7 +4247,7 @@
               <w:rPr>
                 <w:sz w:val="17"/>
               </w:rPr>
-              <w:t xml:space="preserve">0.5412 pm 0.1885</w:t>
+              <w:t xml:space="preserve">0.7545 pm 0.0497</w:t>
             </w:r>
           </w:p>
         </w:tc>
@@ -4263,7 +4263,7 @@
               <w:rPr>
                 <w:sz w:val="17"/>
               </w:rPr>
-              <w:t xml:space="preserve">0.8487 pm 0.0041</w:t>
+              <w:t xml:space="preserve">0.8626 pm 0.0013</w:t>
             </w:r>
           </w:p>
         </w:tc>
@@ -4279,7 +4279,7 @@
               <w:rPr>
                 <w:sz w:val="17"/>
               </w:rPr>
-              <w:t xml:space="preserve">+0.3075</w:t>
+              <w:t xml:space="preserve">+0.1081</w:t>
             </w:r>
           </w:p>
         </w:tc>
@@ -4295,7 +4295,89 @@
               <w:rPr>
                 <w:sz w:val="17"/>
               </w:rPr>
-              <w:t xml:space="preserve">3.60</w:t>
+              <w:t xml:space="preserve">4.76</w:t>
+            </w:r>
+          </w:p>
+        </w:tc>
+      </w:tr>
+      <w:tr>
+        <w:tc>
+          <w:tcPr>
+            <w:tcW w:w="1804" w:type="dxa"/>
+          </w:tcPr>
+          <w:p>
+            <w:pPr>
+              <w:spacing w:before="20" w:after="20"/>
+            </w:pPr>
+            <w:r>
+              <w:rPr>
+                <w:sz w:val="17"/>
+              </w:rPr>
+              <w:t xml:space="preserve">Global macro recall</w:t>
+            </w:r>
+          </w:p>
+        </w:tc>
+        <w:tc>
+          <w:tcPr>
+            <w:tcW w:w="1804" w:type="dxa"/>
+          </w:tcPr>
+          <w:p>
+            <w:pPr>
+              <w:spacing w:before="20" w:after="20"/>
+            </w:pPr>
+            <w:r>
+              <w:rPr>
+                <w:sz w:val="17"/>
+              </w:rPr>
+              <w:t xml:space="preserve">0.1604 pm 0.0370</w:t>
+            </w:r>
+          </w:p>
+        </w:tc>
+        <w:tc>
+          <w:tcPr>
+            <w:tcW w:w="1804" w:type="dxa"/>
+          </w:tcPr>
+          <w:p>
+            <w:pPr>
+              <w:spacing w:before="20" w:after="20"/>
+            </w:pPr>
+            <w:r>
+              <w:rPr>
+                <w:sz w:val="17"/>
+              </w:rPr>
+              <w:t xml:space="preserve">0.2269 pm 0.0043</w:t>
+            </w:r>
+          </w:p>
+        </w:tc>
+        <w:tc>
+          <w:tcPr>
+            <w:tcW w:w="1804" w:type="dxa"/>
+          </w:tcPr>
+          <w:p>
+            <w:pPr>
+              <w:spacing w:before="20" w:after="20"/>
+            </w:pPr>
+            <w:r>
+              <w:rPr>
+                <w:sz w:val="17"/>
+              </w:rPr>
+              <w:t xml:space="preserve">+0.0664</w:t>
+            </w:r>
+          </w:p>
+        </w:tc>
+        <w:tc>
+          <w:tcPr>
+            <w:tcW w:w="1804" w:type="dxa"/>
+          </w:tcPr>
+          <w:p>
+            <w:pPr>
+              <w:spacing w:before="20" w:after="20"/>
+            </w:pPr>
+            <w:r>
+              <w:rPr>
+                <w:sz w:val="17"/>
+              </w:rPr>
+              <w:t xml:space="preserve">4.07</w:t>
             </w:r>
           </w:p>
         </w:tc>
@@ -5347,6 +5429,886 @@
         <w:pStyle w:val="Heading3"/>
       </w:pPr>
       <w:r>
+        <w:t xml:space="preserve">Where the operating point sits</w:t>
+      </w:r>
+    </w:p>
+    <w:p>
+      <w:pPr/>
+      <w:r>
+        <w:t xml:space="preserve">The comparison above uses $\lambda_{team} = 1.5$, chosen before any sweep. A later sweep over six values shows that choice was conservative.</w:t>
+      </w:r>
+    </w:p>
+    <w:tbl>
+      <w:tblPr>
+        <w:tblStyle w:val="TableGrid"/>
+        <w:tblW w:w="9020" w:type="dxa"/>
+      </w:tblPr>
+      <w:tblGrid>
+        <w:gridCol w:w="1804"/>
+        <w:gridCol w:w="1804"/>
+        <w:gridCol w:w="1804"/>
+        <w:gridCol w:w="1804"/>
+        <w:gridCol w:w="1804"/>
+      </w:tblGrid>
+      <w:tr>
+        <w:tc>
+          <w:tcPr>
+            <w:tcW w:w="1804" w:type="dxa"/>
+            <w:shd w:val="clear" w:color="auto" w:fill="EDEDED"/>
+          </w:tcPr>
+          <w:p>
+            <w:pPr>
+              <w:spacing w:before="20" w:after="20"/>
+            </w:pPr>
+            <w:r>
+              <w:rPr>
+                <w:b/>
+                <w:sz w:val="17"/>
+              </w:rPr>
+              <w:t xml:space="preserve">$\lambda_{team}$</w:t>
+            </w:r>
+          </w:p>
+        </w:tc>
+        <w:tc>
+          <w:tcPr>
+            <w:tcW w:w="1804" w:type="dxa"/>
+            <w:shd w:val="clear" w:color="auto" w:fill="EDEDED"/>
+          </w:tcPr>
+          <w:p>
+            <w:pPr>
+              <w:spacing w:before="20" w:after="20"/>
+            </w:pPr>
+            <w:r>
+              <w:rPr>
+                <w:b/>
+                <w:sz w:val="17"/>
+              </w:rPr>
+              <w:t xml:space="preserve">ratio to $\gamma$</w:t>
+            </w:r>
+          </w:p>
+        </w:tc>
+        <w:tc>
+          <w:tcPr>
+            <w:tcW w:w="1804" w:type="dxa"/>
+            <w:shd w:val="clear" w:color="auto" w:fill="EDEDED"/>
+          </w:tcPr>
+          <w:p>
+            <w:pPr>
+              <w:spacing w:before="20" w:after="20"/>
+            </w:pPr>
+            <w:r>
+              <w:rPr>
+                <w:b/>
+                <w:sz w:val="17"/>
+              </w:rPr>
+              <w:t xml:space="preserve">personal macro F1</w:t>
+            </w:r>
+          </w:p>
+        </w:tc>
+        <w:tc>
+          <w:tcPr>
+            <w:tcW w:w="1804" w:type="dxa"/>
+            <w:shd w:val="clear" w:color="auto" w:fill="EDEDED"/>
+          </w:tcPr>
+          <w:p>
+            <w:pPr>
+              <w:spacing w:before="20" w:after="20"/>
+            </w:pPr>
+            <w:r>
+              <w:rPr>
+                <w:b/>
+                <w:sz w:val="17"/>
+              </w:rPr>
+              <w:t xml:space="preserve">global macro F1</w:t>
+            </w:r>
+          </w:p>
+        </w:tc>
+        <w:tc>
+          <w:tcPr>
+            <w:tcW w:w="1804" w:type="dxa"/>
+            <w:shd w:val="clear" w:color="auto" w:fill="EDEDED"/>
+          </w:tcPr>
+          <w:p>
+            <w:pPr>
+              <w:spacing w:before="20" w:after="20"/>
+            </w:pPr>
+            <w:r>
+              <w:rPr>
+                <w:b/>
+                <w:sz w:val="17"/>
+              </w:rPr>
+              <w:t xml:space="preserve">global FPR</w:t>
+            </w:r>
+          </w:p>
+        </w:tc>
+      </w:tr>
+      <w:tr>
+        <w:tc>
+          <w:tcPr>
+            <w:tcW w:w="1804" w:type="dxa"/>
+          </w:tcPr>
+          <w:p>
+            <w:pPr>
+              <w:spacing w:before="20" w:after="20"/>
+            </w:pPr>
+            <w:r>
+              <w:rPr>
+                <w:sz w:val="17"/>
+              </w:rPr>
+              <w:t xml:space="preserve">0.5</w:t>
+            </w:r>
+          </w:p>
+        </w:tc>
+        <w:tc>
+          <w:tcPr>
+            <w:tcW w:w="1804" w:type="dxa"/>
+          </w:tcPr>
+          <w:p>
+            <w:pPr>
+              <w:spacing w:before="20" w:after="20"/>
+            </w:pPr>
+            <w:r>
+              <w:rPr>
+                <w:sz w:val="17"/>
+              </w:rPr>
+              <w:t xml:space="preserve">0.3</w:t>
+            </w:r>
+          </w:p>
+        </w:tc>
+        <w:tc>
+          <w:tcPr>
+            <w:tcW w:w="1804" w:type="dxa"/>
+          </w:tcPr>
+          <w:p>
+            <w:pPr>
+              <w:spacing w:before="20" w:after="20"/>
+            </w:pPr>
+            <w:r>
+              <w:rPr>
+                <w:sz w:val="17"/>
+              </w:rPr>
+              <w:t xml:space="preserve">0.4168</w:t>
+            </w:r>
+          </w:p>
+        </w:tc>
+        <w:tc>
+          <w:tcPr>
+            <w:tcW w:w="1804" w:type="dxa"/>
+          </w:tcPr>
+          <w:p>
+            <w:pPr>
+              <w:spacing w:before="20" w:after="20"/>
+            </w:pPr>
+            <w:r>
+              <w:rPr>
+                <w:sz w:val="17"/>
+              </w:rPr>
+              <w:t xml:space="preserve">0.1529</w:t>
+            </w:r>
+          </w:p>
+        </w:tc>
+        <w:tc>
+          <w:tcPr>
+            <w:tcW w:w="1804" w:type="dxa"/>
+          </w:tcPr>
+          <w:p>
+            <w:pPr>
+              <w:spacing w:before="20" w:after="20"/>
+            </w:pPr>
+            <w:r>
+              <w:rPr>
+                <w:sz w:val="17"/>
+              </w:rPr>
+              <w:t xml:space="preserve">0.0887</w:t>
+            </w:r>
+          </w:p>
+        </w:tc>
+      </w:tr>
+      <w:tr>
+        <w:tc>
+          <w:tcPr>
+            <w:tcW w:w="1804" w:type="dxa"/>
+          </w:tcPr>
+          <w:p>
+            <w:pPr>
+              <w:spacing w:before="20" w:after="20"/>
+            </w:pPr>
+            <w:r>
+              <w:rPr>
+                <w:sz w:val="17"/>
+              </w:rPr>
+              <w:t xml:space="preserve">1.0</w:t>
+            </w:r>
+          </w:p>
+        </w:tc>
+        <w:tc>
+          <w:tcPr>
+            <w:tcW w:w="1804" w:type="dxa"/>
+          </w:tcPr>
+          <w:p>
+            <w:pPr>
+              <w:spacing w:before="20" w:after="20"/>
+            </w:pPr>
+            <w:r>
+              <w:rPr>
+                <w:sz w:val="17"/>
+              </w:rPr>
+              <w:t xml:space="preserve">0.7</w:t>
+            </w:r>
+          </w:p>
+        </w:tc>
+        <w:tc>
+          <w:tcPr>
+            <w:tcW w:w="1804" w:type="dxa"/>
+          </w:tcPr>
+          <w:p>
+            <w:pPr>
+              <w:spacing w:before="20" w:after="20"/>
+            </w:pPr>
+            <w:r>
+              <w:rPr>
+                <w:sz w:val="17"/>
+              </w:rPr>
+              <w:t xml:space="preserve">0.4383</w:t>
+            </w:r>
+          </w:p>
+        </w:tc>
+        <w:tc>
+          <w:tcPr>
+            <w:tcW w:w="1804" w:type="dxa"/>
+          </w:tcPr>
+          <w:p>
+            <w:pPr>
+              <w:spacing w:before="20" w:after="20"/>
+            </w:pPr>
+            <w:r>
+              <w:rPr>
+                <w:sz w:val="17"/>
+              </w:rPr>
+              <w:t xml:space="preserve">0.2169</w:t>
+            </w:r>
+          </w:p>
+        </w:tc>
+        <w:tc>
+          <w:tcPr>
+            <w:tcW w:w="1804" w:type="dxa"/>
+          </w:tcPr>
+          <w:p>
+            <w:pPr>
+              <w:spacing w:before="20" w:after="20"/>
+            </w:pPr>
+            <w:r>
+              <w:rPr>
+                <w:sz w:val="17"/>
+              </w:rPr>
+              <w:t xml:space="preserve">0.0816</w:t>
+            </w:r>
+          </w:p>
+        </w:tc>
+      </w:tr>
+      <w:tr>
+        <w:tc>
+          <w:tcPr>
+            <w:tcW w:w="1804" w:type="dxa"/>
+          </w:tcPr>
+          <w:p>
+            <w:pPr>
+              <w:spacing w:before="20" w:after="20"/>
+            </w:pPr>
+            <w:r>
+              <w:rPr>
+                <w:sz w:val="17"/>
+              </w:rPr>
+              <w:t xml:space="preserve">1.5</w:t>
+            </w:r>
+          </w:p>
+        </w:tc>
+        <w:tc>
+          <w:tcPr>
+            <w:tcW w:w="1804" w:type="dxa"/>
+          </w:tcPr>
+          <w:p>
+            <w:pPr>
+              <w:spacing w:before="20" w:after="20"/>
+            </w:pPr>
+            <w:r>
+              <w:rPr>
+                <w:sz w:val="17"/>
+              </w:rPr>
+              <w:t xml:space="preserve">1.0</w:t>
+            </w:r>
+          </w:p>
+        </w:tc>
+        <w:tc>
+          <w:tcPr>
+            <w:tcW w:w="1804" w:type="dxa"/>
+          </w:tcPr>
+          <w:p>
+            <w:pPr>
+              <w:spacing w:before="20" w:after="20"/>
+            </w:pPr>
+            <w:r>
+              <w:rPr>
+                <w:sz w:val="17"/>
+              </w:rPr>
+              <w:t xml:space="preserve">0.5202</w:t>
+            </w:r>
+          </w:p>
+        </w:tc>
+        <w:tc>
+          <w:tcPr>
+            <w:tcW w:w="1804" w:type="dxa"/>
+          </w:tcPr>
+          <w:p>
+            <w:pPr>
+              <w:spacing w:before="20" w:after="20"/>
+            </w:pPr>
+            <w:r>
+              <w:rPr>
+                <w:sz w:val="17"/>
+              </w:rPr>
+              <w:t xml:space="preserve">0.2480</w:t>
+            </w:r>
+          </w:p>
+        </w:tc>
+        <w:tc>
+          <w:tcPr>
+            <w:tcW w:w="1804" w:type="dxa"/>
+          </w:tcPr>
+          <w:p>
+            <w:pPr>
+              <w:spacing w:before="20" w:after="20"/>
+            </w:pPr>
+            <w:r>
+              <w:rPr>
+                <w:sz w:val="17"/>
+              </w:rPr>
+              <w:t xml:space="preserve">0.0788</w:t>
+            </w:r>
+          </w:p>
+        </w:tc>
+      </w:tr>
+      <w:tr>
+        <w:tc>
+          <w:tcPr>
+            <w:tcW w:w="1804" w:type="dxa"/>
+          </w:tcPr>
+          <w:p>
+            <w:pPr>
+              <w:spacing w:before="20" w:after="20"/>
+            </w:pPr>
+            <w:r>
+              <w:rPr>
+                <w:sz w:val="17"/>
+              </w:rPr>
+              <w:t xml:space="preserve">3.0</w:t>
+            </w:r>
+          </w:p>
+        </w:tc>
+        <w:tc>
+          <w:tcPr>
+            <w:tcW w:w="1804" w:type="dxa"/>
+          </w:tcPr>
+          <w:p>
+            <w:pPr>
+              <w:spacing w:before="20" w:after="20"/>
+            </w:pPr>
+            <w:r>
+              <w:rPr>
+                <w:sz w:val="17"/>
+              </w:rPr>
+              <w:t xml:space="preserve">2.0</w:t>
+            </w:r>
+          </w:p>
+        </w:tc>
+        <w:tc>
+          <w:tcPr>
+            <w:tcW w:w="1804" w:type="dxa"/>
+          </w:tcPr>
+          <w:p>
+            <w:pPr>
+              <w:spacing w:before="20" w:after="20"/>
+            </w:pPr>
+            <w:r>
+              <w:rPr>
+                <w:sz w:val="17"/>
+              </w:rPr>
+              <w:t xml:space="preserve">0.5818</w:t>
+            </w:r>
+          </w:p>
+        </w:tc>
+        <w:tc>
+          <w:tcPr>
+            <w:tcW w:w="1804" w:type="dxa"/>
+          </w:tcPr>
+          <w:p>
+            <w:pPr>
+              <w:spacing w:before="20" w:after="20"/>
+            </w:pPr>
+            <w:r>
+              <w:rPr>
+                <w:sz w:val="17"/>
+              </w:rPr>
+              <w:t xml:space="preserve">0.2603</w:t>
+            </w:r>
+          </w:p>
+        </w:tc>
+        <w:tc>
+          <w:tcPr>
+            <w:tcW w:w="1804" w:type="dxa"/>
+          </w:tcPr>
+          <w:p>
+            <w:pPr>
+              <w:spacing w:before="20" w:after="20"/>
+            </w:pPr>
+            <w:r>
+              <w:rPr>
+                <w:sz w:val="17"/>
+              </w:rPr>
+              <w:t xml:space="preserve">0.0757</w:t>
+            </w:r>
+          </w:p>
+        </w:tc>
+      </w:tr>
+      <w:tr>
+        <w:tc>
+          <w:tcPr>
+            <w:tcW w:w="1804" w:type="dxa"/>
+          </w:tcPr>
+          <w:p>
+            <w:pPr>
+              <w:spacing w:before="20" w:after="20"/>
+            </w:pPr>
+            <w:r>
+              <w:rPr>
+                <w:sz w:val="17"/>
+              </w:rPr>
+              <w:t xml:space="preserve">6.0</w:t>
+            </w:r>
+          </w:p>
+        </w:tc>
+        <w:tc>
+          <w:tcPr>
+            <w:tcW w:w="1804" w:type="dxa"/>
+          </w:tcPr>
+          <w:p>
+            <w:pPr>
+              <w:spacing w:before="20" w:after="20"/>
+            </w:pPr>
+            <w:r>
+              <w:rPr>
+                <w:sz w:val="17"/>
+              </w:rPr>
+              <w:t xml:space="preserve">4.0</w:t>
+            </w:r>
+          </w:p>
+        </w:tc>
+        <w:tc>
+          <w:tcPr>
+            <w:tcW w:w="1804" w:type="dxa"/>
+          </w:tcPr>
+          <w:p>
+            <w:pPr>
+              <w:spacing w:before="20" w:after="20"/>
+            </w:pPr>
+            <w:r>
+              <w:rPr>
+                <w:sz w:val="17"/>
+              </w:rPr>
+              <w:t xml:space="preserve">0.6480</w:t>
+            </w:r>
+          </w:p>
+        </w:tc>
+        <w:tc>
+          <w:tcPr>
+            <w:tcW w:w="1804" w:type="dxa"/>
+          </w:tcPr>
+          <w:p>
+            <w:pPr>
+              <w:spacing w:before="20" w:after="20"/>
+            </w:pPr>
+            <w:r>
+              <w:rPr>
+                <w:sz w:val="17"/>
+              </w:rPr>
+              <w:t xml:space="preserve">0.4046</w:t>
+            </w:r>
+          </w:p>
+        </w:tc>
+        <w:tc>
+          <w:tcPr>
+            <w:tcW w:w="1804" w:type="dxa"/>
+          </w:tcPr>
+          <w:p>
+            <w:pPr>
+              <w:spacing w:before="20" w:after="20"/>
+            </w:pPr>
+            <w:r>
+              <w:rPr>
+                <w:sz w:val="17"/>
+              </w:rPr>
+              <w:t xml:space="preserve">0.0642</w:t>
+            </w:r>
+          </w:p>
+        </w:tc>
+      </w:tr>
+      <w:tr>
+        <w:tc>
+          <w:tcPr>
+            <w:tcW w:w="1804" w:type="dxa"/>
+          </w:tcPr>
+          <w:p>
+            <w:pPr>
+              <w:spacing w:before="20" w:after="20"/>
+            </w:pPr>
+            <w:r>
+              <w:rPr>
+                <w:sz w:val="17"/>
+              </w:rPr>
+              <w:t xml:space="preserve">12.0</w:t>
+            </w:r>
+          </w:p>
+        </w:tc>
+        <w:tc>
+          <w:tcPr>
+            <w:tcW w:w="1804" w:type="dxa"/>
+          </w:tcPr>
+          <w:p>
+            <w:pPr>
+              <w:spacing w:before="20" w:after="20"/>
+            </w:pPr>
+            <w:r>
+              <w:rPr>
+                <w:sz w:val="17"/>
+              </w:rPr>
+              <w:t xml:space="preserve">8.0</w:t>
+            </w:r>
+          </w:p>
+        </w:tc>
+        <w:tc>
+          <w:tcPr>
+            <w:tcW w:w="1804" w:type="dxa"/>
+          </w:tcPr>
+          <w:p>
+            <w:pPr>
+              <w:spacing w:before="20" w:after="20"/>
+            </w:pPr>
+            <w:r>
+              <w:rPr>
+                <w:sz w:val="17"/>
+              </w:rPr>
+              <w:t xml:space="preserve">0.8440</w:t>
+            </w:r>
+          </w:p>
+        </w:tc>
+        <w:tc>
+          <w:tcPr>
+            <w:tcW w:w="1804" w:type="dxa"/>
+          </w:tcPr>
+          <w:p>
+            <w:pPr>
+              <w:spacing w:before="20" w:after="20"/>
+            </w:pPr>
+            <w:r>
+              <w:rPr>
+                <w:sz w:val="17"/>
+              </w:rPr>
+              <w:t xml:space="preserve">0.5341</w:t>
+            </w:r>
+          </w:p>
+        </w:tc>
+        <w:tc>
+          <w:tcPr>
+            <w:tcW w:w="1804" w:type="dxa"/>
+          </w:tcPr>
+          <w:p>
+            <w:pPr>
+              <w:spacing w:before="20" w:after="20"/>
+            </w:pPr>
+            <w:r>
+              <w:rPr>
+                <w:sz w:val="17"/>
+              </w:rPr>
+              <w:t xml:space="preserve">0.0475</w:t>
+            </w:r>
+          </w:p>
+        </w:tc>
+      </w:tr>
+    </w:tbl>
+    <w:p/>
+    <w:p>
+      <w:pPr/>
+      <w:r>
+        <w:t xml:space="preserve">Monotone on both tiers and on false-positive rate, with no turnover. The stability condition permits values below 31.8, so the sweep exhausted its range rather than finding an optimum.</w:t>
+      </w:r>
+    </w:p>
+    <w:p>
+      <w:pPr/>
+      <w:r>
+        <w:t xml:space="preserve">The operating point matters for more than the headline figure. Per-class detection on the global model, at three settings:</w:t>
+      </w:r>
+    </w:p>
+    <w:tbl>
+      <w:tblPr>
+        <w:tblStyle w:val="TableGrid"/>
+        <w:tblW w:w="9020" w:type="dxa"/>
+      </w:tblPr>
+      <w:tblGrid>
+        <w:gridCol w:w="3006"/>
+        <w:gridCol w:w="3006"/>
+        <w:gridCol w:w="3006"/>
+      </w:tblGrid>
+      <w:tr>
+        <w:tc>
+          <w:tcPr>
+            <w:tcW w:w="3006" w:type="dxa"/>
+            <w:shd w:val="clear" w:color="auto" w:fill="EDEDED"/>
+          </w:tcPr>
+          <w:p>
+            <w:pPr>
+              <w:spacing w:before="20" w:after="20"/>
+            </w:pPr>
+            <w:r>
+              <w:rPr>
+                <w:b/>
+                <w:sz w:val="17"/>
+              </w:rPr>
+              <w:t xml:space="preserve">configuration</w:t>
+            </w:r>
+          </w:p>
+        </w:tc>
+        <w:tc>
+          <w:tcPr>
+            <w:tcW w:w="3006" w:type="dxa"/>
+            <w:shd w:val="clear" w:color="auto" w:fill="EDEDED"/>
+          </w:tcPr>
+          <w:p>
+            <w:pPr>
+              <w:spacing w:before="20" w:after="20"/>
+            </w:pPr>
+            <w:r>
+              <w:rPr>
+                <w:b/>
+                <w:sz w:val="17"/>
+              </w:rPr>
+              <w:t xml:space="preserve">classes detected</w:t>
+            </w:r>
+          </w:p>
+        </w:tc>
+        <w:tc>
+          <w:tcPr>
+            <w:tcW w:w="3006" w:type="dxa"/>
+            <w:shd w:val="clear" w:color="auto" w:fill="EDEDED"/>
+          </w:tcPr>
+          <w:p>
+            <w:pPr>
+              <w:spacing w:before="20" w:after="20"/>
+            </w:pPr>
+            <w:r>
+              <w:rPr>
+                <w:b/>
+                <w:sz w:val="17"/>
+              </w:rPr>
+              <w:t xml:space="preserve">attack classes sent entirely to benign</w:t>
+            </w:r>
+          </w:p>
+        </w:tc>
+      </w:tr>
+      <w:tr>
+        <w:tc>
+          <w:tcPr>
+            <w:tcW w:w="3006" w:type="dxa"/>
+          </w:tcPr>
+          <w:p>
+            <w:pPr>
+              <w:spacing w:before="20" w:after="20"/>
+            </w:pPr>
+            <w:r>
+              <w:rPr>
+                <w:sz w:val="17"/>
+              </w:rPr>
+              <w:t xml:space="preserve">PerMFL</w:t>
+            </w:r>
+          </w:p>
+        </w:tc>
+        <w:tc>
+          <w:tcPr>
+            <w:tcW w:w="3006" w:type="dxa"/>
+          </w:tcPr>
+          <w:p>
+            <w:pPr>
+              <w:spacing w:before="20" w:after="20"/>
+            </w:pPr>
+            <w:r>
+              <w:rPr>
+                <w:sz w:val="17"/>
+              </w:rPr>
+              <w:t xml:space="preserve">2 of 9</w:t>
+            </w:r>
+          </w:p>
+        </w:tc>
+        <w:tc>
+          <w:tcPr>
+            <w:tcW w:w="3006" w:type="dxa"/>
+          </w:tcPr>
+          <w:p>
+            <w:pPr>
+              <w:spacing w:before="20" w:after="20"/>
+            </w:pPr>
+            <w:r>
+              <w:rPr>
+                <w:sz w:val="17"/>
+              </w:rPr>
+              <w:t xml:space="preserve">3 of 8</w:t>
+            </w:r>
+          </w:p>
+        </w:tc>
+      </w:tr>
+      <w:tr>
+        <w:tc>
+          <w:tcPr>
+            <w:tcW w:w="3006" w:type="dxa"/>
+          </w:tcPr>
+          <w:p>
+            <w:pPr>
+              <w:spacing w:before="20" w:after="20"/>
+            </w:pPr>
+            <w:r>
+              <w:rPr>
+                <w:sz w:val="17"/>
+              </w:rPr>
+              <w:t xml:space="preserve">Split-λ, $\lambda_{team} = 1.5$</w:t>
+            </w:r>
+          </w:p>
+        </w:tc>
+        <w:tc>
+          <w:tcPr>
+            <w:tcW w:w="3006" w:type="dxa"/>
+          </w:tcPr>
+          <w:p>
+            <w:pPr>
+              <w:spacing w:before="20" w:after="20"/>
+            </w:pPr>
+            <w:r>
+              <w:rPr>
+                <w:sz w:val="17"/>
+              </w:rPr>
+              <w:t xml:space="preserve">3 of 9</w:t>
+            </w:r>
+          </w:p>
+        </w:tc>
+        <w:tc>
+          <w:tcPr>
+            <w:tcW w:w="3006" w:type="dxa"/>
+          </w:tcPr>
+          <w:p>
+            <w:pPr>
+              <w:spacing w:before="20" w:after="20"/>
+            </w:pPr>
+            <w:r>
+              <w:rPr>
+                <w:sz w:val="17"/>
+              </w:rPr>
+              <w:t xml:space="preserve">5 of 8</w:t>
+            </w:r>
+          </w:p>
+        </w:tc>
+      </w:tr>
+      <w:tr>
+        <w:tc>
+          <w:tcPr>
+            <w:tcW w:w="3006" w:type="dxa"/>
+          </w:tcPr>
+          <w:p>
+            <w:pPr>
+              <w:spacing w:before="20" w:after="20"/>
+            </w:pPr>
+            <w:r>
+              <w:rPr>
+                <w:sz w:val="17"/>
+              </w:rPr>
+              <w:t xml:space="preserve">Split-λ, $\lambda_{team} = 12.0$</w:t>
+            </w:r>
+          </w:p>
+        </w:tc>
+        <w:tc>
+          <w:tcPr>
+            <w:tcW w:w="3006" w:type="dxa"/>
+          </w:tcPr>
+          <w:p>
+            <w:pPr>
+              <w:spacing w:before="20" w:after="20"/>
+            </w:pPr>
+            <w:r>
+              <w:rPr>
+                <w:sz w:val="17"/>
+              </w:rPr>
+              <w:t xml:space="preserve">7 of 9</w:t>
+            </w:r>
+          </w:p>
+        </w:tc>
+        <w:tc>
+          <w:tcPr>
+            <w:tcW w:w="3006" w:type="dxa"/>
+          </w:tcPr>
+          <w:p>
+            <w:pPr>
+              <w:spacing w:before="20" w:after="20"/>
+            </w:pPr>
+            <w:r>
+              <w:rPr>
+                <w:sz w:val="17"/>
+              </w:rPr>
+              <w:t xml:space="preserve">1 of 8</w:t>
+            </w:r>
+          </w:p>
+        </w:tc>
+      </w:tr>
+    </w:tbl>
+    <w:p/>
+    <w:p>
+      <w:pPr/>
+      <w:r>
+        <w:t xml:space="preserve">At 1.5 the global model is not usable as a detector, and its errors concentrate on the benign class, which is the more dangerous failure in this setting because a misclassified attack still raises an alert while a benign classification does not. At 12.0 four further classes gain detection and that failure mode largely disappears.</w:t>
+      </w:r>
+    </w:p>
+    <w:p>
+      <w:pPr/>
+      <w:r>
+        <w:t xml:space="preserve">Against this, at 12.0 the team model is weighted eight times more toward its own members than toward the global model, which is closer to a per-team federated average with a weak global anchor than to the method as published. The results below use 1.5 throughout, and the higher setting is reported as evidence that the correction is not exhausted rather than as the configuration under test.</w:t>
+      </w:r>
+    </w:p>
+    <w:p>
+      <w:pPr>
+        <w:pStyle w:val="Heading3"/>
+      </w:pPr>
+      <w:r>
+        <w:t xml:space="preserve">Two mechanisms that did not help</w:t>
+      </w:r>
+    </w:p>
+    <w:p>
+      <w:pPr/>
+      <w:r>
+        <w:t xml:space="preserve">Two changes were implemented and measured, and neither moved a metric. Both are recorded because a negative result narrows the space of explanations.</w:t>
+      </w:r>
+    </w:p>
+    <w:p>
+      <w:pPr/>
+      <w:r>
+        <w:t xml:space="preserve">The drift-triggered reclustering was run with thresholds read from 1782 logged reclustering events rather than chosen a priori. Gating reduced reclustering from 99 rounds in 100 to roughly 25 and halved the variance of cluster agreement, and changed no metric on either tier by more than one standard deviation. Cluster agreement with the true partition stayed near 0.32 at every setting, so the clustering never recovers the domain structure it is intended to find.</w:t>
+      </w:r>
+    </w:p>
+    <w:p>
+      <w:pPr/>
+      <w:r>
+        <w:t xml:space="preserve">A class-weighted loss was implemented on the hypothesis that the objective and the reported metric disagree, since the loss is unweighted while macro F1 weights every class equally on a corpus that is 81.7 per cent benign. Weighting each class by the inverse of its frequency in a client's own labels changed nothing on either arm and left per-class detection identical. The likely reason, untested, is that weights computed within a client are close to uniform when that client holds few classes, while the imbalance the weights were meant to counter exists across clients rather than inside any one of them.</w:t>
+      </w:r>
+    </w:p>
+    <w:p>
+      <w:pPr>
+        <w:pStyle w:val="Heading3"/>
+      </w:pPr>
+      <w:r>
         <w:t xml:space="preserve">Variance</w:t>
       </w:r>
     </w:p>
@@ -6641,13 +7603,19 @@
     <w:p>
       <w:pPr/>
       <w:r>
-        <w:t xml:space="preserve">One configuration goes the other way. Under attack-domain partitioning on TON-IoT, at the highest heterogeneity measured anywhere in the study, the global macro F1 falls from 0.0917 to 0.0403, $t = -6.21$, losing on all five seeds. The Split-λ global accuracy is 0.2369 with a standard deviation of zero, which is exactly the majority-class rate: the model collapsed to predicting normal traffic.</w:t>
-      </w:r>
-    </w:p>
-    <w:p>
-      <w:pPr/>
-      <w:r>
-        <w:t xml:space="preserve">This bounds the claim. Making the global model listen harder to strongly specialised teams can destroy it.</w:t>
+        <w:t xml:space="preserve">One configuration appeared to go the other way, and the reason it did not is instructive. Under attack-domain partitioning on TON-IoT, at ten global rounds with five hundred local steps, global macro F1 fell from 0.0917 to 0.0403, $t = -6.21$, losing on all five seeds, with Split-λ global accuracy pinned at 0.2369, exactly the majority-class rate.</w:t>
+      </w:r>
+    </w:p>
+    <w:p>
+      <w:pPr/>
+      <w:r>
+        <w:t xml:space="preserve">Re-running the same comparison at one hundred global rounds with twenty local steps, the shape used everywhere else in this study and by the original paper, reverses it completely: global macro F1 rises from 0.1007 to 0.1574, $t = 4.14$, winning on all five seeds.</w:t>
+      </w:r>
+    </w:p>
+    <w:p>
+      <w:pPr/>
+      <w:r>
+        <w:t xml:space="preserve">The apparent regression was an artefact of measuring both models before either had converged. It is reported here rather than removed because the earlier configuration was a legitimate reading of the loader defaults at the time, and because the episode establishes that horizon choice can invert a result's sign on this data.</w:t>
       </w:r>
     </w:p>
     <w:p>

</xml_diff>